<commit_message>
Update TAME combined document with tables
</commit_message>
<xml_diff>
--- a/Patient education/經動脈微細血管栓塞術治療慢性疼痛.docx
+++ b/Patient education/經動脈微細血管栓塞術治療慢性疼痛.docx
@@ -15,6 +15,4609 @@
       <w:pgMar w:top="1440" w:right="1800" w:bottom="1440" w:left="1800" w:header="720" w:footer="720" w:gutter="0"/>
       <w:cols w:space="720"/>
       <w:docGrid w:linePitch="360"/>
+    </w:sectPr>
+    <w:p>
+      <w:pPr>
+        <w:widowControl/>
+        <w:spacing w:before="100" w:beforeAutospacing="1" w:after="100" w:afterAutospacing="1" w:line="240" w:lineRule="auto"/>
+        <w:outlineLvl w:val="2"/>
+        <w:rPr>
+          <w:rFonts w:ascii="新細明體" w:eastAsia="新細明體" w:hAnsi="新細明體" w:cs="新細明體"/>
+          <w:b/>
+          <w:bCs/>
+          <w:color w:val="000000"/>
+          <w:kern w:val="0"/>
+          <w:sz w:val="27"/>
+          <w:szCs w:val="27"/>
+          <w14:ligatures w14:val="none"/>
+        </w:rPr>
+      </w:pPr>
+      <w:r>
+        <w:rPr>
+          <w:rFonts w:ascii="新細明體" w:eastAsia="新細明體" w:hAnsi="新細明體" w:cs="新細明體"/>
+          <w:b/>
+          <w:bCs/>
+          <w:color w:val="000000"/>
+          <w:kern w:val="0"/>
+          <w:sz w:val="27"/>
+          <w:szCs w:val="27"/>
+          <w14:ligatures w14:val="none"/>
+        </w:rPr>
+        <w:t>告別</w:t>
+      </w:r>
+      <w:r>
+        <w:rPr>
+          <w:rFonts w:ascii="新細明體" w:eastAsia="新細明體" w:hAnsi="新細明體" w:cs="新細明體" w:hint="eastAsia"/>
+          <w:b/>
+          <w:bCs/>
+          <w:color w:val="000000"/>
+          <w:kern w:val="0"/>
+          <w:sz w:val="27"/>
+          <w:szCs w:val="27"/>
+          <w14:ligatures w14:val="none"/>
+        </w:rPr>
+        <w:t>慢性</w:t>
+      </w:r>
+      <w:r>
+        <w:rPr>
+          <w:rFonts w:ascii="新細明體" w:eastAsia="新細明體" w:hAnsi="新細明體" w:cs="新細明體" w:hint="eastAsia"/>
+          <w:b/>
+          <w:bCs/>
+          <w:color w:val="000000"/>
+          <w:kern w:val="0"/>
+          <w:sz w:val="27"/>
+          <w:szCs w:val="27"/>
+          <w14:ligatures w14:val="none"/>
+        </w:rPr>
+        <w:t>疼</w:t>
+      </w:r>
+      <w:r>
+        <w:rPr>
+          <w:rFonts w:ascii="新細明體" w:eastAsia="新細明體" w:hAnsi="新細明體" w:cs="新細明體"/>
+          <w:b/>
+          <w:bCs/>
+          <w:color w:val="000000"/>
+          <w:kern w:val="0"/>
+          <w:sz w:val="27"/>
+          <w:szCs w:val="27"/>
+          <w14:ligatures w14:val="none"/>
+        </w:rPr>
+        <w:t>痛：經動脈微細</w:t>
+      </w:r>
+      <w:r>
+        <w:rPr>
+          <w:rFonts w:ascii="新細明體" w:eastAsia="新細明體" w:hAnsi="新細明體" w:cs="新細明體" w:hint="eastAsia"/>
+          <w:b/>
+          <w:bCs/>
+          <w:color w:val="000000"/>
+          <w:kern w:val="0"/>
+          <w:sz w:val="27"/>
+          <w:szCs w:val="27"/>
+          <w14:ligatures w14:val="none"/>
+        </w:rPr>
+        <w:t>血管</w:t>
+      </w:r>
+      <w:r>
+        <w:rPr>
+          <w:rFonts w:ascii="新細明體" w:eastAsia="新細明體" w:hAnsi="新細明體" w:cs="新細明體"/>
+          <w:b/>
+          <w:bCs/>
+          <w:color w:val="000000"/>
+          <w:kern w:val="0"/>
+          <w:sz w:val="27"/>
+          <w:szCs w:val="27"/>
+          <w14:ligatures w14:val="none"/>
+        </w:rPr>
+        <w:t>栓塞術 (TAME) 實用指南</w:t>
+      </w:r>
+    </w:p>
+    <w:p>
+      <w:pPr>
+        <w:widowControl/>
+        <w:spacing w:before="100" w:beforeAutospacing="1" w:after="100" w:afterAutospacing="1" w:line="240" w:lineRule="auto"/>
+        <w:rPr>
+          <w:rFonts w:ascii="新細明體" w:eastAsia="新細明體" w:hAnsi="新細明體" w:cs="新細明體"/>
+          <w:color w:val="000000"/>
+          <w:kern w:val="0"/>
+          <w14:ligatures w14:val="none"/>
+        </w:rPr>
+      </w:pPr>
+      <w:r>
+        <w:rPr>
+          <w:rFonts w:ascii="新細明體" w:eastAsia="新細明體" w:hAnsi="新細明體" w:cs="新細明體"/>
+          <w:color w:val="000000"/>
+          <w:kern w:val="0"/>
+          <w14:ligatures w14:val="none"/>
+        </w:rPr>
+        <w:t>長期飽受關節炎、五十肩、足底筋膜炎折磨，吃藥復健卻無法斷根？醫學研究發現，慢性疼痛的元凶往往是受損組織周邊長出的「異常新生血管」與伴隨的「敏感感覺神經」。</w:t>
+      </w:r>
+    </w:p>
+    <w:p>
+      <w:pPr>
+        <w:widowControl/>
+        <w:spacing w:before="100" w:beforeAutospacing="1" w:after="100" w:afterAutospacing="1" w:line="240" w:lineRule="auto"/>
+        <w:rPr>
+          <w:rFonts w:ascii="新細明體" w:eastAsia="新細明體" w:hAnsi="新細明體" w:cs="新細明體"/>
+          <w:color w:val="000000"/>
+          <w:kern w:val="0"/>
+          <w14:ligatures w14:val="none"/>
+        </w:rPr>
+      </w:pPr>
+      <w:r>
+        <w:rPr>
+          <w:rFonts w:ascii="新細明體" w:eastAsia="新細明體" w:hAnsi="新細明體" w:cs="新細明體"/>
+          <w:b/>
+          <w:bCs/>
+          <w:color w:val="000000"/>
+          <w:kern w:val="0"/>
+          <w14:ligatures w14:val="none"/>
+        </w:rPr>
+        <w:t>經微細動脈栓塞術 (TAME)</w:t>
+      </w:r>
+      <w:r>
+        <w:rPr>
+          <w:rFonts w:ascii="新細明體" w:eastAsia="新細明體" w:hAnsi="新細明體" w:cs="新細明體"/>
+          <w:color w:val="000000"/>
+          <w:kern w:val="0"/>
+          <w14:ligatures w14:val="none"/>
+        </w:rPr>
+        <w:t> 是一種微創治療，透過注入暫時性栓塞藥物，精準堵住這些異常血管，讓神經萎縮，從根源消除發炎與疼痛。</w:t>
+      </w:r>
+    </w:p>
+    <w:p>
+      <w:pPr>
+        <w:widowControl/>
+        <w:spacing w:before="100" w:beforeAutospacing="1" w:after="100" w:afterAutospacing="1" w:line="240" w:lineRule="auto"/>
+        <w:outlineLvl w:val="3"/>
+        <w:rPr>
+          <w:rFonts w:ascii="新細明體" w:eastAsia="新細明體" w:hAnsi="新細明體" w:cs="新細明體"/>
+          <w:b/>
+          <w:bCs/>
+          <w:color w:val="000000"/>
+          <w:kern w:val="0"/>
+          <w14:ligatures w14:val="none"/>
+        </w:rPr>
+      </w:pPr>
+      <w:r>
+        <w:rPr>
+          <w:rFonts w:ascii="新細明體" w:eastAsia="新細明體" w:hAnsi="新細明體" w:cs="新細明體"/>
+          <w:b/>
+          <w:bCs/>
+          <w:color w:val="000000"/>
+          <w:kern w:val="0"/>
+          <w14:ligatures w14:val="none"/>
+        </w:rPr>
+        <w:t>一、 TAME 的兩大類型</w:t>
+      </w:r>
+    </w:p>
+    <w:p>
+      <w:pPr>
+        <w:widowControl/>
+        <w:spacing w:before="100" w:beforeAutospacing="1" w:after="100" w:afterAutospacing="1" w:line="240" w:lineRule="auto"/>
+        <w:rPr>
+          <w:rFonts w:ascii="新細明體" w:eastAsia="新細明體" w:hAnsi="新細明體" w:cs="新細明體"/>
+          <w:color w:val="000000"/>
+          <w:kern w:val="0"/>
+          <w14:ligatures w14:val="none"/>
+        </w:rPr>
+      </w:pPr>
+      <w:r>
+        <w:rPr>
+          <w:rFonts w:ascii="新細明體" w:eastAsia="新細明體" w:hAnsi="新細明體" w:cs="新細明體"/>
+          <w:color w:val="000000"/>
+          <w:kern w:val="0"/>
+          <w14:ligatures w14:val="none"/>
+        </w:rPr>
+        <w:t>依據疼痛部位深淺，醫師會選擇最適合的方式：</w:t>
+      </w:r>
+    </w:p>
+    <w:p>
+      <w:pPr>
+        <w:widowControl/>
+        <w:numPr>
+          <w:ilvl w:val="0"/>
+          <w:numId w:val="1"/>
+        </w:numPr>
+        <w:spacing w:before="100" w:beforeAutospacing="1" w:after="100" w:afterAutospacing="1" w:line="240" w:lineRule="auto"/>
+        <w:rPr>
+          <w:rFonts w:ascii="新細明體" w:eastAsia="新細明體" w:hAnsi="新細明體" w:cs="新細明體"/>
+          <w:color w:val="000000"/>
+          <w:kern w:val="0"/>
+          <w14:ligatures w14:val="none"/>
+        </w:rPr>
+      </w:pPr>
+      <w:r>
+        <w:rPr>
+          <w:rFonts w:ascii="新細明體" w:eastAsia="新細明體" w:hAnsi="新細明體" w:cs="新細明體"/>
+          <w:b/>
+          <w:bCs/>
+          <w:color w:val="000000"/>
+          <w:kern w:val="0"/>
+          <w14:ligatures w14:val="none"/>
+        </w:rPr>
+        <w:t>簡易型 (</w:t>
+      </w:r>
+      <w:proofErr w:type="spellStart"/>
+      <w:r>
+        <w:rPr>
+          <w:rFonts w:ascii="新細明體" w:eastAsia="新細明體" w:hAnsi="新細明體" w:cs="新細明體"/>
+          <w:b/>
+          <w:bCs/>
+          <w:color w:val="000000"/>
+          <w:kern w:val="0"/>
+          <w14:ligatures w14:val="none"/>
+        </w:rPr>
+        <w:t>sTAME</w:t>
+      </w:r>
+      <w:proofErr w:type="spellEnd"/>
+      <w:r>
+        <w:rPr>
+          <w:rFonts w:ascii="新細明體" w:eastAsia="新細明體" w:hAnsi="新細明體" w:cs="新細明體"/>
+          <w:b/>
+          <w:bCs/>
+          <w:color w:val="000000"/>
+          <w:kern w:val="0"/>
+          <w14:ligatures w14:val="none"/>
+        </w:rPr>
+        <w:t>)</w:t>
+      </w:r>
+      <w:r>
+        <w:rPr>
+          <w:rFonts w:ascii="新細明體" w:eastAsia="新細明體" w:hAnsi="新細明體" w:cs="新細明體"/>
+          <w:color w:val="000000"/>
+          <w:kern w:val="0"/>
+          <w14:ligatures w14:val="none"/>
+        </w:rPr>
+        <w:t>：</w:t>
+      </w:r>
+    </w:p>
+    <w:p>
+      <w:pPr>
+        <w:widowControl/>
+        <w:numPr>
+          <w:ilvl w:val="1"/>
+          <w:numId w:val="1"/>
+        </w:numPr>
+        <w:spacing w:before="100" w:beforeAutospacing="1" w:after="100" w:afterAutospacing="1" w:line="240" w:lineRule="auto"/>
+        <w:rPr>
+          <w:rFonts w:ascii="新細明體" w:eastAsia="新細明體" w:hAnsi="新細明體" w:cs="新細明體"/>
+          <w:color w:val="000000"/>
+          <w:kern w:val="0"/>
+          <w14:ligatures w14:val="none"/>
+        </w:rPr>
+      </w:pPr>
+      <w:r>
+        <w:rPr>
+          <w:rFonts w:ascii="新細明體" w:eastAsia="新細明體" w:hAnsi="新細明體" w:cs="新細明體"/>
+          <w:b/>
+          <w:bCs/>
+          <w:color w:val="000000"/>
+          <w:kern w:val="0"/>
+          <w14:ligatures w14:val="none"/>
+        </w:rPr>
+        <w:t>特色</w:t>
+      </w:r>
+      <w:r>
+        <w:rPr>
+          <w:rFonts w:ascii="新細明體" w:eastAsia="新細明體" w:hAnsi="新細明體" w:cs="新細明體"/>
+          <w:color w:val="000000"/>
+          <w:kern w:val="0"/>
+          <w14:ligatures w14:val="none"/>
+        </w:rPr>
+        <w:t>：不需進開刀房，在</w:t>
+      </w:r>
+      <w:r>
+        <w:rPr>
+          <w:rFonts w:ascii="新細明體" w:eastAsia="新細明體" w:hAnsi="新細明體" w:cs="新細明體"/>
+          <w:b/>
+          <w:bCs/>
+          <w:color w:val="000000"/>
+          <w:kern w:val="0"/>
+          <w14:ligatures w14:val="none"/>
+        </w:rPr>
+        <w:t>一般門診透過超音波導引</w:t>
+      </w:r>
+      <w:r>
+        <w:rPr>
+          <w:rFonts w:ascii="新細明體" w:eastAsia="新細明體" w:hAnsi="新細明體" w:cs="新細明體"/>
+          <w:color w:val="000000"/>
+          <w:kern w:val="0"/>
+          <w14:ligatures w14:val="none"/>
+        </w:rPr>
+        <w:t>即可完成，無 X 光輻射，穿刺孔極小，便利性高。</w:t>
+      </w:r>
+    </w:p>
+    <w:p>
+      <w:pPr>
+        <w:widowControl/>
+        <w:numPr>
+          <w:ilvl w:val="1"/>
+          <w:numId w:val="1"/>
+        </w:numPr>
+        <w:spacing w:before="100" w:beforeAutospacing="1" w:after="100" w:afterAutospacing="1" w:line="240" w:lineRule="auto"/>
+        <w:rPr>
+          <w:rFonts w:ascii="新細明體" w:eastAsia="新細明體" w:hAnsi="新細明體" w:cs="新細明體"/>
+          <w:color w:val="000000"/>
+          <w:kern w:val="0"/>
+          <w14:ligatures w14:val="none"/>
+        </w:rPr>
+      </w:pPr>
+      <w:r>
+        <w:rPr>
+          <w:rFonts w:ascii="新細明體" w:eastAsia="新細明體" w:hAnsi="新細明體" w:cs="新細明體"/>
+          <w:b/>
+          <w:bCs/>
+          <w:color w:val="000000"/>
+          <w:kern w:val="0"/>
+          <w14:ligatures w14:val="none"/>
+        </w:rPr>
+        <w:t>適用部位（表淺/遠端）</w:t>
+      </w:r>
+      <w:r>
+        <w:rPr>
+          <w:rFonts w:ascii="新細明體" w:eastAsia="新細明體" w:hAnsi="新細明體" w:cs="新細明體"/>
+          <w:color w:val="000000"/>
+          <w:kern w:val="0"/>
+          <w14:ligatures w14:val="none"/>
+        </w:rPr>
+        <w:t>：手指與拇指關節炎、媽媽手 (狄奎凡氏症)、足底筋膜炎、拇趾外翻痛、腳趾蹠趾關節痛。</w:t>
+      </w:r>
+    </w:p>
+    <w:p>
+      <w:pPr>
+        <w:widowControl/>
+        <w:numPr>
+          <w:ilvl w:val="0"/>
+          <w:numId w:val="1"/>
+        </w:numPr>
+        <w:spacing w:before="100" w:beforeAutospacing="1" w:after="100" w:afterAutospacing="1" w:line="240" w:lineRule="auto"/>
+        <w:rPr>
+          <w:rFonts w:ascii="新細明體" w:eastAsia="新細明體" w:hAnsi="新細明體" w:cs="新細明體"/>
+          <w:color w:val="000000"/>
+          <w:kern w:val="0"/>
+          <w14:ligatures w14:val="none"/>
+        </w:rPr>
+      </w:pPr>
+      <w:r>
+        <w:rPr>
+          <w:rFonts w:ascii="新細明體" w:eastAsia="新細明體" w:hAnsi="新細明體" w:cs="新細明體"/>
+          <w:b/>
+          <w:bCs/>
+          <w:color w:val="000000"/>
+          <w:kern w:val="0"/>
+          <w14:ligatures w14:val="none"/>
+        </w:rPr>
+        <w:t>傳統型 (TAME)</w:t>
+      </w:r>
+      <w:r>
+        <w:rPr>
+          <w:rFonts w:ascii="新細明體" w:eastAsia="新細明體" w:hAnsi="新細明體" w:cs="新細明體"/>
+          <w:color w:val="000000"/>
+          <w:kern w:val="0"/>
+          <w14:ligatures w14:val="none"/>
+        </w:rPr>
+        <w:t>：</w:t>
+      </w:r>
+    </w:p>
+    <w:p>
+      <w:pPr>
+        <w:widowControl/>
+        <w:numPr>
+          <w:ilvl w:val="1"/>
+          <w:numId w:val="1"/>
+        </w:numPr>
+        <w:spacing w:before="100" w:beforeAutospacing="1" w:after="100" w:afterAutospacing="1" w:line="240" w:lineRule="auto"/>
+        <w:rPr>
+          <w:rFonts w:ascii="新細明體" w:eastAsia="新細明體" w:hAnsi="新細明體" w:cs="新細明體"/>
+          <w:color w:val="000000"/>
+          <w:kern w:val="0"/>
+          <w14:ligatures w14:val="none"/>
+        </w:rPr>
+      </w:pPr>
+      <w:r>
+        <w:rPr>
+          <w:rFonts w:ascii="新細明體" w:eastAsia="新細明體" w:hAnsi="新細明體" w:cs="新細明體"/>
+          <w:b/>
+          <w:bCs/>
+          <w:color w:val="000000"/>
+          <w:kern w:val="0"/>
+          <w14:ligatures w14:val="none"/>
+        </w:rPr>
+        <w:t>特色</w:t>
+      </w:r>
+      <w:r>
+        <w:rPr>
+          <w:rFonts w:ascii="新細明體" w:eastAsia="新細明體" w:hAnsi="新細明體" w:cs="新細明體"/>
+          <w:color w:val="000000"/>
+          <w:kern w:val="0"/>
+          <w14:ligatures w14:val="none"/>
+        </w:rPr>
+        <w:t>：需在醫院的 </w:t>
+      </w:r>
+      <w:r>
+        <w:rPr>
+          <w:rFonts w:ascii="新細明體" w:eastAsia="新細明體" w:hAnsi="新細明體" w:cs="新細明體"/>
+          <w:b/>
+          <w:bCs/>
+          <w:color w:val="000000"/>
+          <w:kern w:val="0"/>
+          <w14:ligatures w14:val="none"/>
+        </w:rPr>
+        <w:t>X 光血管攝影室</w:t>
+      </w:r>
+      <w:r>
+        <w:rPr>
+          <w:rFonts w:ascii="新細明體" w:eastAsia="新細明體" w:hAnsi="新細明體" w:cs="新細明體"/>
+          <w:color w:val="000000"/>
+          <w:kern w:val="0"/>
+          <w14:ligatures w14:val="none"/>
+        </w:rPr>
+        <w:t>進行，利用極細微導管與 X 光顯影揪出深層異常血管。</w:t>
+      </w:r>
+    </w:p>
+    <w:p>
+      <w:pPr>
+        <w:widowControl/>
+        <w:numPr>
+          <w:ilvl w:val="1"/>
+          <w:numId w:val="1"/>
+        </w:numPr>
+        <w:spacing w:before="100" w:beforeAutospacing="1" w:after="100" w:afterAutospacing="1" w:line="240" w:lineRule="auto"/>
+        <w:rPr>
+          <w:rFonts w:ascii="新細明體" w:eastAsia="新細明體" w:hAnsi="新細明體" w:cs="新細明體"/>
+          <w:color w:val="000000"/>
+          <w:kern w:val="0"/>
+          <w14:ligatures w14:val="none"/>
+        </w:rPr>
+      </w:pPr>
+      <w:r>
+        <w:rPr>
+          <w:rFonts w:ascii="新細明體" w:eastAsia="新細明體" w:hAnsi="新細明體" w:cs="新細明體"/>
+          <w:b/>
+          <w:bCs/>
+          <w:color w:val="000000"/>
+          <w:kern w:val="0"/>
+          <w14:ligatures w14:val="none"/>
+        </w:rPr>
+        <w:t>適用部位（深層/大關節）</w:t>
+      </w:r>
+      <w:r>
+        <w:rPr>
+          <w:rFonts w:ascii="新細明體" w:eastAsia="新細明體" w:hAnsi="新細明體" w:cs="新細明體"/>
+          <w:color w:val="000000"/>
+          <w:kern w:val="0"/>
+          <w14:ligatures w14:val="none"/>
+        </w:rPr>
+        <w:t>：退化性膝關節炎、五十肩、網球肘/高爾夫球肘、跳躍膝、慢性下背痛、肩頸痠痛、骨盆腔痛，甚至幻肢痛。</w:t>
+      </w:r>
+    </w:p>
+    <w:p>
+      <w:pPr>
+        <w:widowControl/>
+        <w:spacing w:before="100" w:beforeAutospacing="1" w:after="100" w:afterAutospacing="1" w:line="240" w:lineRule="auto"/>
+        <w:outlineLvl w:val="3"/>
+        <w:rPr>
+          <w:rFonts w:ascii="新細明體" w:eastAsia="新細明體" w:hAnsi="新細明體" w:cs="新細明體"/>
+          <w:b/>
+          <w:bCs/>
+          <w:color w:val="000000"/>
+          <w:kern w:val="0"/>
+          <w14:ligatures w14:val="none"/>
+        </w:rPr>
+      </w:pPr>
+      <w:r>
+        <w:rPr>
+          <w:rFonts w:ascii="新細明體" w:eastAsia="新細明體" w:hAnsi="新細明體" w:cs="新細明體"/>
+          <w:b/>
+          <w:bCs/>
+          <w:color w:val="000000"/>
+          <w:kern w:val="0"/>
+          <w14:ligatures w14:val="none"/>
+        </w:rPr>
+        <w:t>二、 誰適合做？ (病患篩選與禁忌症)</w:t>
+      </w:r>
+    </w:p>
+    <w:p>
+      <w:pPr>
+        <w:widowControl/>
+        <w:numPr>
+          <w:ilvl w:val="0"/>
+          <w:numId w:val="2"/>
+        </w:numPr>
+        <w:spacing w:before="100" w:beforeAutospacing="1" w:after="100" w:afterAutospacing="1" w:line="240" w:lineRule="auto"/>
+        <w:rPr>
+          <w:rFonts w:ascii="新細明體" w:eastAsia="新細明體" w:hAnsi="新細明體" w:cs="新細明體"/>
+          <w:color w:val="000000"/>
+          <w:kern w:val="0"/>
+          <w14:ligatures w14:val="none"/>
+        </w:rPr>
+      </w:pPr>
+      <w:r>
+        <w:rPr>
+          <w:rFonts w:ascii="新細明體" w:eastAsia="新細明體" w:hAnsi="新細明體" w:cs="新細明體"/>
+          <w:b/>
+          <w:bCs/>
+          <w:color w:val="000000"/>
+          <w:kern w:val="0"/>
+          <w14:ligatures w14:val="none"/>
+        </w:rPr>
+        <w:t>適合對象</w:t>
+      </w:r>
+      <w:r>
+        <w:rPr>
+          <w:rFonts w:ascii="新細明體" w:eastAsia="新細明體" w:hAnsi="新細明體" w:cs="新細明體"/>
+          <w:color w:val="000000"/>
+          <w:kern w:val="0"/>
+          <w14:ligatures w14:val="none"/>
+        </w:rPr>
+        <w:t>：疼痛持續超過 3 到 6 個月，且經過吃藥、復健、局部打針等「保守治療」均無效的中重度疼痛患者。</w:t>
+      </w:r>
+    </w:p>
+    <w:p>
+      <w:pPr>
+        <w:widowControl/>
+        <w:numPr>
+          <w:ilvl w:val="0"/>
+          <w:numId w:val="2"/>
+        </w:numPr>
+        <w:spacing w:before="100" w:beforeAutospacing="1" w:after="100" w:afterAutospacing="1" w:line="240" w:lineRule="auto"/>
+        <w:rPr>
+          <w:rFonts w:ascii="新細明體" w:eastAsia="新細明體" w:hAnsi="新細明體" w:cs="新細明體"/>
+          <w:color w:val="000000"/>
+          <w:kern w:val="0"/>
+          <w14:ligatures w14:val="none"/>
+        </w:rPr>
+      </w:pPr>
+      <w:r>
+        <w:rPr>
+          <w:rFonts w:ascii="新細明體" w:eastAsia="新細明體" w:hAnsi="新細明體" w:cs="新細明體"/>
+          <w:b/>
+          <w:bCs/>
+          <w:color w:val="000000"/>
+          <w:kern w:val="0"/>
+          <w14:ligatures w14:val="none"/>
+        </w:rPr>
+        <w:t>不適合對象 (禁忌症)</w:t>
+      </w:r>
+      <w:r>
+        <w:rPr>
+          <w:rFonts w:ascii="新細明體" w:eastAsia="新細明體" w:hAnsi="新細明體" w:cs="新細明體"/>
+          <w:color w:val="000000"/>
+          <w:kern w:val="0"/>
+          <w14:ligatures w14:val="none"/>
+        </w:rPr>
+        <w:t>：關節已「嚴重退化」（如膝關節第 4 期，通常需直接換人工關節）、需開刀的嚴重肌腱/半月板斷裂、局部有活動性感染、嚴重動脈硬化或腫瘤患者。</w:t>
+      </w:r>
+    </w:p>
+    <w:p>
+      <w:pPr>
+        <w:widowControl/>
+        <w:spacing w:before="100" w:beforeAutospacing="1" w:after="100" w:afterAutospacing="1" w:line="240" w:lineRule="auto"/>
+        <w:outlineLvl w:val="3"/>
+        <w:rPr>
+          <w:rFonts w:ascii="新細明體" w:eastAsia="新細明體" w:hAnsi="新細明體" w:cs="新細明體"/>
+          <w:b/>
+          <w:bCs/>
+          <w:color w:val="000000"/>
+          <w:kern w:val="0"/>
+          <w14:ligatures w14:val="none"/>
+        </w:rPr>
+      </w:pPr>
+      <w:r>
+        <w:rPr>
+          <w:rFonts w:ascii="新細明體" w:eastAsia="新細明體" w:hAnsi="新細明體" w:cs="新細明體"/>
+          <w:b/>
+          <w:bCs/>
+          <w:color w:val="000000"/>
+          <w:kern w:val="0"/>
+          <w14:ligatures w14:val="none"/>
+        </w:rPr>
+        <w:t>三、 術前評估：為何建議做 MRI？</w:t>
+      </w:r>
+    </w:p>
+    <w:p>
+      <w:pPr>
+        <w:widowControl/>
+        <w:spacing w:before="100" w:beforeAutospacing="1" w:after="100" w:afterAutospacing="1" w:line="240" w:lineRule="auto"/>
+        <w:rPr>
+          <w:rFonts w:ascii="新細明體" w:eastAsia="新細明體" w:hAnsi="新細明體" w:cs="新細明體"/>
+          <w:color w:val="000000"/>
+          <w:kern w:val="0"/>
+          <w14:ligatures w14:val="none"/>
+        </w:rPr>
+      </w:pPr>
+      <w:r>
+        <w:rPr>
+          <w:rFonts w:ascii="新細明體" w:eastAsia="新細明體" w:hAnsi="新細明體" w:cs="新細明體"/>
+          <w:color w:val="000000"/>
+          <w:kern w:val="0"/>
+          <w14:ligatures w14:val="none"/>
+        </w:rPr>
+        <w:t>在決定治療前，建議進行 </w:t>
+      </w:r>
+      <w:r>
+        <w:rPr>
+          <w:rFonts w:ascii="新細明體" w:eastAsia="新細明體" w:hAnsi="新細明體" w:cs="新細明體"/>
+          <w:b/>
+          <w:bCs/>
+          <w:color w:val="000000"/>
+          <w:kern w:val="0"/>
+          <w14:ligatures w14:val="none"/>
+        </w:rPr>
+        <w:t>MRI (核磁共振)</w:t>
+      </w:r>
+      <w:r>
+        <w:rPr>
+          <w:rFonts w:ascii="新細明體" w:eastAsia="新細明體" w:hAnsi="新細明體" w:cs="新細明體"/>
+          <w:color w:val="000000"/>
+          <w:kern w:val="0"/>
+          <w14:ligatures w14:val="none"/>
+        </w:rPr>
+        <w:t> 檢查。MRI 不僅能排除上述需要開刀的嚴重破裂，還能精準揪出 X 光看不到的隱藏發炎病灶，例如「軟骨下骨髓病變」。研究證實，若 MRI 顯示有這類發炎，接受 TAME 治療的止痛效果特別好，且術後病灶甚至會隨之縮小修復。</w:t>
+      </w:r>
+    </w:p>
+    <w:p>
+      <w:pPr>
+        <w:widowControl/>
+        <w:spacing w:before="100" w:beforeAutospacing="1" w:after="100" w:afterAutospacing="1" w:line="240" w:lineRule="auto"/>
+        <w:outlineLvl w:val="3"/>
+        <w:rPr>
+          <w:rFonts w:ascii="新細明體" w:eastAsia="新細明體" w:hAnsi="新細明體" w:cs="新細明體"/>
+          <w:b/>
+          <w:bCs/>
+          <w:color w:val="000000"/>
+          <w:kern w:val="0"/>
+          <w14:ligatures w14:val="none"/>
+        </w:rPr>
+      </w:pPr>
+      <w:r>
+        <w:rPr>
+          <w:rFonts w:ascii="新細明體" w:eastAsia="新細明體" w:hAnsi="新細明體" w:cs="新細明體"/>
+          <w:b/>
+          <w:bCs/>
+          <w:color w:val="000000"/>
+          <w:kern w:val="0"/>
+          <w14:ligatures w14:val="none"/>
+        </w:rPr>
+        <w:t>四、 治療感受、安全性與潛在風險</w:t>
+      </w:r>
+    </w:p>
+    <w:p>
+      <w:pPr>
+        <w:widowControl/>
+        <w:numPr>
+          <w:ilvl w:val="0"/>
+          <w:numId w:val="3"/>
+        </w:numPr>
+        <w:spacing w:before="100" w:beforeAutospacing="1" w:after="100" w:afterAutospacing="1" w:line="240" w:lineRule="auto"/>
+        <w:rPr>
+          <w:rFonts w:ascii="新細明體" w:eastAsia="新細明體" w:hAnsi="新細明體" w:cs="新細明體"/>
+          <w:color w:val="000000"/>
+          <w:kern w:val="0"/>
+          <w14:ligatures w14:val="none"/>
+        </w:rPr>
+      </w:pPr>
+      <w:r>
+        <w:rPr>
+          <w:rFonts w:ascii="新細明體" w:eastAsia="新細明體" w:hAnsi="新細明體" w:cs="新細明體"/>
+          <w:b/>
+          <w:bCs/>
+          <w:color w:val="000000"/>
+          <w:kern w:val="0"/>
+          <w14:ligatures w14:val="none"/>
+        </w:rPr>
+        <w:lastRenderedPageBreak/>
+        <w:t>什麼是「誘發痛」？</w:t>
+      </w:r>
+      <w:r>
+        <w:rPr>
+          <w:rFonts w:ascii="新細明體" w:eastAsia="新細明體" w:hAnsi="新細明體" w:cs="新細明體"/>
+          <w:color w:val="000000"/>
+          <w:kern w:val="0"/>
+          <w14:ligatures w14:val="none"/>
+        </w:rPr>
+        <w:t> 手術僅需局部麻醉。當藥物注入異常血管時，您平時的疼痛處會出現短暫的「發熱或痠痛感」，這稱為「誘發痛」，是</w:t>
+      </w:r>
+      <w:r>
+        <w:rPr>
+          <w:rFonts w:ascii="新細明體" w:eastAsia="新細明體" w:hAnsi="新細明體" w:cs="新細明體"/>
+          <w:b/>
+          <w:bCs/>
+          <w:color w:val="000000"/>
+          <w:kern w:val="0"/>
+          <w14:ligatures w14:val="none"/>
+        </w:rPr>
+        <w:t>好現象</w:t>
+      </w:r>
+      <w:r>
+        <w:rPr>
+          <w:rFonts w:ascii="新細明體" w:eastAsia="新細明體" w:hAnsi="新細明體" w:cs="新細明體"/>
+          <w:color w:val="000000"/>
+          <w:kern w:val="0"/>
+          <w14:ligatures w14:val="none"/>
+        </w:rPr>
+        <w:t>，代表醫師精確打擊到痛源。注射完幾分鐘內痠痛即會消失。</w:t>
+      </w:r>
+    </w:p>
+    <w:p>
+      <w:pPr>
+        <w:widowControl/>
+        <w:numPr>
+          <w:ilvl w:val="0"/>
+          <w:numId w:val="3"/>
+        </w:numPr>
+        <w:spacing w:before="100" w:beforeAutospacing="1" w:after="100" w:afterAutospacing="1" w:line="240" w:lineRule="auto"/>
+        <w:rPr>
+          <w:rFonts w:ascii="新細明體" w:eastAsia="新細明體" w:hAnsi="新細明體" w:cs="新細明體"/>
+          <w:color w:val="000000"/>
+          <w:kern w:val="0"/>
+          <w14:ligatures w14:val="none"/>
+        </w:rPr>
+      </w:pPr>
+      <w:r>
+        <w:rPr>
+          <w:rFonts w:ascii="新細明體" w:eastAsia="新細明體" w:hAnsi="新細明體" w:cs="新細明體"/>
+          <w:b/>
+          <w:bCs/>
+          <w:color w:val="000000"/>
+          <w:kern w:val="0"/>
+          <w14:ligatures w14:val="none"/>
+        </w:rPr>
+        <w:t>安全性極高</w:t>
+      </w:r>
+      <w:r>
+        <w:rPr>
+          <w:rFonts w:ascii="新細明體" w:eastAsia="新細明體" w:hAnsi="新細明體" w:cs="新細明體"/>
+          <w:color w:val="000000"/>
+          <w:kern w:val="0"/>
+          <w14:ligatures w14:val="none"/>
+        </w:rPr>
+        <w:t>：臨床證實此技術</w:t>
+      </w:r>
+      <w:r>
+        <w:rPr>
+          <w:rFonts w:ascii="新細明體" w:eastAsia="新細明體" w:hAnsi="新細明體" w:cs="新細明體"/>
+          <w:b/>
+          <w:bCs/>
+          <w:color w:val="000000"/>
+          <w:kern w:val="0"/>
+          <w14:ligatures w14:val="none"/>
+        </w:rPr>
+        <w:t>無嚴重併發症</w:t>
+      </w:r>
+      <w:r>
+        <w:rPr>
+          <w:rFonts w:ascii="新細明體" w:eastAsia="新細明體" w:hAnsi="新細明體" w:cs="新細明體"/>
+          <w:color w:val="000000"/>
+          <w:kern w:val="0"/>
+          <w14:ligatures w14:val="none"/>
+        </w:rPr>
+        <w:t>，不會造成組織壞死、肌肉萎縮或永久神經損傷。</w:t>
+      </w:r>
+    </w:p>
+    <w:p>
+      <w:pPr>
+        <w:widowControl/>
+        <w:numPr>
+          <w:ilvl w:val="0"/>
+          <w:numId w:val="3"/>
+        </w:numPr>
+        <w:spacing w:before="100" w:beforeAutospacing="1" w:after="100" w:afterAutospacing="1" w:line="240" w:lineRule="auto"/>
+        <w:rPr>
+          <w:rFonts w:ascii="新細明體" w:eastAsia="新細明體" w:hAnsi="新細明體" w:cs="新細明體"/>
+          <w:color w:val="000000"/>
+          <w:kern w:val="0"/>
+          <w14:ligatures w14:val="none"/>
+        </w:rPr>
+      </w:pPr>
+      <w:r>
+        <w:rPr>
+          <w:rFonts w:ascii="新細明體" w:eastAsia="新細明體" w:hAnsi="新細明體" w:cs="新細明體"/>
+          <w:b/>
+          <w:bCs/>
+          <w:color w:val="000000"/>
+          <w:kern w:val="0"/>
+          <w14:ligatures w14:val="none"/>
+        </w:rPr>
+        <w:t>傳統型 TAME 的特別注意事項</w:t>
+      </w:r>
+      <w:r>
+        <w:rPr>
+          <w:rFonts w:ascii="新細明體" w:eastAsia="新細明體" w:hAnsi="新細明體" w:cs="新細明體"/>
+          <w:color w:val="000000"/>
+          <w:kern w:val="0"/>
+          <w14:ligatures w14:val="none"/>
+        </w:rPr>
+        <w:t>： 相較於簡易型，傳統型 TAME 雖然精準，但因流程需求，有以下幾點輕微風險需留意：</w:t>
+      </w:r>
+    </w:p>
+    <w:p>
+      <w:pPr>
+        <w:widowControl/>
+        <w:numPr>
+          <w:ilvl w:val="1"/>
+          <w:numId w:val="3"/>
+        </w:numPr>
+        <w:spacing w:before="100" w:beforeAutospacing="1" w:after="100" w:afterAutospacing="1" w:line="240" w:lineRule="auto"/>
+        <w:rPr>
+          <w:rFonts w:ascii="新細明體" w:eastAsia="新細明體" w:hAnsi="新細明體" w:cs="新細明體"/>
+          <w:color w:val="000000"/>
+          <w:kern w:val="0"/>
+          <w14:ligatures w14:val="none"/>
+        </w:rPr>
+      </w:pPr>
+      <w:r>
+        <w:rPr>
+          <w:rFonts w:ascii="新細明體" w:eastAsia="新細明體" w:hAnsi="新細明體" w:cs="新細明體"/>
+          <w:b/>
+          <w:bCs/>
+          <w:color w:val="000000"/>
+          <w:kern w:val="0"/>
+          <w14:ligatures w14:val="none"/>
+        </w:rPr>
+        <w:t>藥物過敏反應</w:t>
+      </w:r>
+      <w:r>
+        <w:rPr>
+          <w:rFonts w:ascii="新細明體" w:eastAsia="新細明體" w:hAnsi="新細明體" w:cs="新細明體"/>
+          <w:color w:val="000000"/>
+          <w:kern w:val="0"/>
+          <w14:ligatures w14:val="none"/>
+        </w:rPr>
+        <w:t>：傳統型術中為了防止血栓，會常規施打抗凝血劑（Heparin / 肝素）；此外，使用的栓塞藥物（如 IPM/CS）本質為抗生素衍生物，兩者皆有極低機率引發輕微過敏或短暫起紅疹、發癢。</w:t>
+      </w:r>
+    </w:p>
+    <w:p>
+      <w:pPr>
+        <w:widowControl/>
+        <w:numPr>
+          <w:ilvl w:val="1"/>
+          <w:numId w:val="3"/>
+        </w:numPr>
+        <w:spacing w:before="100" w:beforeAutospacing="1" w:after="100" w:afterAutospacing="1" w:line="240" w:lineRule="auto"/>
+        <w:rPr>
+          <w:rFonts w:ascii="新細明體" w:eastAsia="新細明體" w:hAnsi="新細明體" w:cs="新細明體"/>
+          <w:color w:val="000000"/>
+          <w:kern w:val="0"/>
+          <w14:ligatures w14:val="none"/>
+        </w:rPr>
+      </w:pPr>
+      <w:r>
+        <w:rPr>
+          <w:rFonts w:ascii="新細明體" w:eastAsia="新細明體" w:hAnsi="新細明體" w:cs="新細明體"/>
+          <w:b/>
+          <w:bCs/>
+          <w:color w:val="000000"/>
+          <w:kern w:val="0"/>
+          <w14:ligatures w14:val="none"/>
+        </w:rPr>
+        <w:t>局部血腫風險</w:t>
+      </w:r>
+      <w:r>
+        <w:rPr>
+          <w:rFonts w:ascii="新細明體" w:eastAsia="新細明體" w:hAnsi="新細明體" w:cs="新細明體"/>
+          <w:color w:val="000000"/>
+          <w:kern w:val="0"/>
+          <w14:ligatures w14:val="none"/>
+        </w:rPr>
+        <w:t>：傳統型需將動脈血管鞘（較大管徑的導管）置入鼠蹊部或手腕的動脈，</w:t>
+      </w:r>
+      <w:r>
+        <w:rPr>
+          <w:rFonts w:ascii="新細明體" w:eastAsia="新細明體" w:hAnsi="新細明體" w:cs="新細明體"/>
+          <w:b/>
+          <w:bCs/>
+          <w:color w:val="000000"/>
+          <w:kern w:val="0"/>
+          <w14:ligatures w14:val="none"/>
+        </w:rPr>
+        <w:t>穿刺孔較大</w:t>
+      </w:r>
+      <w:r>
+        <w:rPr>
+          <w:rFonts w:ascii="新細明體" w:eastAsia="新細明體" w:hAnsi="新細明體" w:cs="新細明體"/>
+          <w:color w:val="000000"/>
+          <w:kern w:val="0"/>
+          <w14:ligatures w14:val="none"/>
+        </w:rPr>
+        <w:t>。若術後沒有經過足夠時間的</w:t>
+      </w:r>
+      <w:r>
+        <w:rPr>
+          <w:rFonts w:ascii="新細明體" w:eastAsia="新細明體" w:hAnsi="新細明體" w:cs="新細明體"/>
+          <w:b/>
+          <w:bCs/>
+          <w:color w:val="000000"/>
+          <w:kern w:val="0"/>
+          <w14:ligatures w14:val="none"/>
+        </w:rPr>
+        <w:t>妥善加壓止血</w:t>
+      </w:r>
+      <w:r>
+        <w:rPr>
+          <w:rFonts w:ascii="新細明體" w:eastAsia="新細明體" w:hAnsi="新細明體" w:cs="新細明體"/>
+          <w:color w:val="000000"/>
+          <w:kern w:val="0"/>
+          <w14:ligatures w14:val="none"/>
+        </w:rPr>
+        <w:t>，可能在打針部位產生局部皮下血腫，少數甚至會形成假性動脈瘤（需進一步修補）。只要配合醫囑確實加壓休息，少數的微瘀血通常在一週內即會自然消退。</w:t>
+      </w:r>
+    </w:p>
+    <w:p>
+      <w:pPr>
+        <w:widowControl/>
+        <w:spacing w:before="100" w:beforeAutospacing="1" w:after="100" w:afterAutospacing="1" w:line="240" w:lineRule="auto"/>
+        <w:outlineLvl w:val="3"/>
+        <w:rPr>
+          <w:rFonts w:ascii="新細明體" w:eastAsia="新細明體" w:hAnsi="新細明體" w:cs="新細明體"/>
+          <w:b/>
+          <w:bCs/>
+          <w:color w:val="000000"/>
+          <w:kern w:val="0"/>
+          <w14:ligatures w14:val="none"/>
+        </w:rPr>
+      </w:pPr>
+      <w:r>
+        <w:rPr>
+          <w:rFonts w:ascii="新細明體" w:eastAsia="新細明體" w:hAnsi="新細明體" w:cs="新細明體"/>
+          <w:b/>
+          <w:bCs/>
+          <w:color w:val="000000"/>
+          <w:kern w:val="0"/>
+          <w14:ligatures w14:val="none"/>
+        </w:rPr>
+        <w:t>五、 治療預後與恢復時程</w:t>
+      </w:r>
+    </w:p>
+    <w:p>
+      <w:pPr>
+        <w:widowControl/>
+        <w:spacing w:before="100" w:beforeAutospacing="1" w:after="100" w:afterAutospacing="1" w:line="240" w:lineRule="auto"/>
+        <w:rPr>
+          <w:rFonts w:ascii="新細明體" w:eastAsia="新細明體" w:hAnsi="新細明體" w:cs="新細明體"/>
+          <w:color w:val="000000"/>
+          <w:kern w:val="0"/>
+          <w14:ligatures w14:val="none"/>
+        </w:rPr>
+      </w:pPr>
+      <w:r>
+        <w:rPr>
+          <w:rFonts w:ascii="新細明體" w:eastAsia="新細明體" w:hAnsi="新細明體" w:cs="新細明體"/>
+          <w:color w:val="000000"/>
+          <w:kern w:val="0"/>
+          <w14:ligatures w14:val="none"/>
+        </w:rPr>
+        <w:t>止痛效果具備「兩階段」優勢：</w:t>
+      </w:r>
+    </w:p>
+    <w:p>
+      <w:pPr>
+        <w:widowControl/>
+        <w:numPr>
+          <w:ilvl w:val="0"/>
+          <w:numId w:val="4"/>
+        </w:numPr>
+        <w:spacing w:before="100" w:beforeAutospacing="1" w:after="100" w:afterAutospacing="1" w:line="240" w:lineRule="auto"/>
+        <w:rPr>
+          <w:rFonts w:ascii="新細明體" w:eastAsia="新細明體" w:hAnsi="新細明體" w:cs="新細明體"/>
+          <w:color w:val="000000"/>
+          <w:kern w:val="0"/>
+          <w14:ligatures w14:val="none"/>
+        </w:rPr>
+      </w:pPr>
+      <w:r>
+        <w:rPr>
+          <w:rFonts w:ascii="新細明體" w:eastAsia="新細明體" w:hAnsi="新細明體" w:cs="新細明體"/>
+          <w:b/>
+          <w:bCs/>
+          <w:color w:val="000000"/>
+          <w:kern w:val="0"/>
+          <w14:ligatures w14:val="none"/>
+        </w:rPr>
+        <w:t>快速緩解期</w:t>
+      </w:r>
+      <w:r>
+        <w:rPr>
+          <w:rFonts w:ascii="新細明體" w:eastAsia="新細明體" w:hAnsi="新細明體" w:cs="新細明體"/>
+          <w:color w:val="000000"/>
+          <w:kern w:val="0"/>
+          <w14:ligatures w14:val="none"/>
+        </w:rPr>
+        <w:t>：異常神經受阻斷，術後 1 週內即有感（例如：五十肩的夜間痛能大幅減輕）。</w:t>
+      </w:r>
+    </w:p>
+    <w:p>
+      <w:pPr>
+        <w:widowControl/>
+        <w:numPr>
+          <w:ilvl w:val="0"/>
+          <w:numId w:val="4"/>
+        </w:numPr>
+        <w:spacing w:before="100" w:beforeAutospacing="1" w:after="100" w:afterAutospacing="1" w:line="240" w:lineRule="auto"/>
+        <w:rPr>
+          <w:rFonts w:ascii="新細明體" w:eastAsia="新細明體" w:hAnsi="新細明體" w:cs="新細明體"/>
+          <w:color w:val="000000"/>
+          <w:kern w:val="0"/>
+          <w14:ligatures w14:val="none"/>
+        </w:rPr>
+      </w:pPr>
+      <w:r>
+        <w:rPr>
+          <w:rFonts w:ascii="新細明體" w:eastAsia="新細明體" w:hAnsi="新細明體" w:cs="新細明體"/>
+          <w:b/>
+          <w:bCs/>
+          <w:color w:val="000000"/>
+          <w:kern w:val="0"/>
+          <w14:ligatures w14:val="none"/>
+        </w:rPr>
+        <w:t>長期修復期</w:t>
+      </w:r>
+      <w:r>
+        <w:rPr>
+          <w:rFonts w:ascii="新細明體" w:eastAsia="新細明體" w:hAnsi="新細明體" w:cs="新細明體"/>
+          <w:color w:val="000000"/>
+          <w:kern w:val="0"/>
+          <w14:ligatures w14:val="none"/>
+        </w:rPr>
+        <w:t>：隨著發炎細胞減少，術後 1 至 6 個月內疼痛會持續且穩定地下降。</w:t>
+      </w:r>
+    </w:p>
+    <w:p>
+      <w:pPr>
+        <w:widowControl/>
+        <w:spacing w:before="100" w:beforeAutospacing="1" w:after="100" w:afterAutospacing="1" w:line="240" w:lineRule="auto"/>
+        <w:rPr>
+          <w:rFonts w:ascii="新細明體" w:eastAsia="新細明體" w:hAnsi="新細明體" w:cs="新細明體"/>
+          <w:color w:val="000000"/>
+          <w:kern w:val="0"/>
+          <w14:ligatures w14:val="none"/>
+        </w:rPr>
+      </w:pPr>
+      <w:r>
+        <w:rPr>
+          <w:rFonts w:ascii="新細明體" w:eastAsia="新細明體" w:hAnsi="新細明體" w:cs="新細明體"/>
+          <w:color w:val="000000"/>
+          <w:kern w:val="0"/>
+          <w14:ligatures w14:val="none"/>
+        </w:rPr>
+        <w:t>整體而言，術後半年至兩年的</w:t>
+      </w:r>
+      <w:r>
+        <w:rPr>
+          <w:rFonts w:ascii="新細明體" w:eastAsia="新細明體" w:hAnsi="新細明體" w:cs="新細明體"/>
+          <w:b/>
+          <w:bCs/>
+          <w:color w:val="000000"/>
+          <w:kern w:val="0"/>
+          <w14:ligatures w14:val="none"/>
+        </w:rPr>
+        <w:t>臨床成功率高達 70% 至 90%</w:t>
+      </w:r>
+      <w:r>
+        <w:rPr>
+          <w:rFonts w:ascii="新細明體" w:eastAsia="新細明體" w:hAnsi="新細明體" w:cs="新細明體"/>
+          <w:color w:val="000000"/>
+          <w:kern w:val="0"/>
+          <w14:ligatures w14:val="none"/>
+        </w:rPr>
+        <w:t>。透過完善的醫病溝通與術後止血照護，TAME 能幫助多數患者擺脫長期對止痛藥的依賴，重拾無痛的生活品質。</w:t>
+      </w:r>
+    </w:p>
+    <w:p/>
+    <w:sectPr>
+      <w:pgSz w:w="11906" w:h="16838"/>
+      <w:pgMar w:top="1440" w:right="1800" w:bottom="1440" w:left="1800" w:header="851" w:footer="992" w:gutter="0"/>
+      <w:cols w:space="425"/>
+      <w:docGrid w:type="lines" w:linePitch="360"/>
+    </w:sectPr>
+    <w:p>
+      <w:r>
+        <w:rPr>
+          <w:rFonts w:hint="eastAsia"/>
+          <w:b/>
+          <w:bCs/>
+        </w:rPr>
+        <w:t>表一：可透過</w:t>
+      </w:r>
+      <w:r>
+        <w:rPr>
+          <w:b/>
+          <w:bCs/>
+        </w:rPr>
+        <w:t xml:space="preserve"> </w:t>
+      </w:r>
+      <w:proofErr w:type="spellStart"/>
+      <w:r>
+        <w:rPr>
+          <w:b/>
+          <w:bCs/>
+        </w:rPr>
+        <w:t>sTAME</w:t>
+      </w:r>
+      <w:proofErr w:type="spellEnd"/>
+      <w:r>
+        <w:rPr>
+          <w:b/>
+          <w:bCs/>
+        </w:rPr>
+        <w:t xml:space="preserve"> (</w:t>
+      </w:r>
+      <w:r>
+        <w:rPr>
+          <w:rFonts w:hint="eastAsia"/>
+          <w:b/>
+          <w:bCs/>
+        </w:rPr>
+        <w:t>簡易型</w:t>
+      </w:r>
+      <w:r>
+        <w:rPr>
+          <w:b/>
+          <w:bCs/>
+        </w:rPr>
+        <w:t xml:space="preserve">) </w:t>
+      </w:r>
+      <w:r>
+        <w:rPr>
+          <w:rFonts w:hint="eastAsia"/>
+          <w:b/>
+          <w:bCs/>
+        </w:rPr>
+        <w:t>進行的適應症</w:t>
+      </w:r>
+      <w:r>
+        <w:rPr>
+          <w:b/>
+          <w:bCs/>
+        </w:rPr>
+        <w:t xml:space="preserve"> (</w:t>
+      </w:r>
+      <w:r>
+        <w:rPr>
+          <w:rFonts w:hint="eastAsia"/>
+          <w:b/>
+          <w:bCs/>
+        </w:rPr>
+        <w:t>遠端肢體與表淺組織</w:t>
+      </w:r>
+      <w:r>
+        <w:rPr>
+          <w:b/>
+          <w:bCs/>
+        </w:rPr>
+        <w:t>)</w:t>
+      </w:r>
+    </w:p>
+    <w:p>
+      <w:r>
+        <w:rPr>
+          <w:rFonts w:hint="eastAsia"/>
+        </w:rPr>
+        <w:t>這些部位的血管較為表淺，適合在門診透過超音波導引針對遠端動脈（如橈動脈、尺動脈、脛後動脈等）進行簡易型微細動脈栓塞。</w:t>
+      </w:r>
+    </w:p>
+    <w:p>
+      <w:pPr>
+        <w:rPr>
+          <w:rFonts w:hint="eastAsia"/>
+        </w:rPr>
+      </w:pPr>
+    </w:p>
+    <w:tbl>
+      <w:tblPr>
+        <w:tblW w:w="0" w:type="auto"/>
+        <w:tblBorders>
+          <w:top w:val="single" w:sz="2" w:space="0" w:color="A3A3A3"/>
+          <w:left w:val="single" w:sz="2" w:space="0" w:color="A3A3A3"/>
+          <w:bottom w:val="single" w:sz="2" w:space="0" w:color="A3A3A3"/>
+          <w:right w:val="single" w:sz="2" w:space="0" w:color="A3A3A3"/>
+        </w:tblBorders>
+        <w:tblCellMar>
+          <w:left w:w="0" w:type="dxa"/>
+          <w:right w:w="0" w:type="dxa"/>
+        </w:tblCellMar>
+        <w:tblLook w:val="04A0" w:firstRow="1" w:lastRow="0" w:firstColumn="1" w:lastColumn="0" w:noHBand="0" w:noVBand="1"/>
+        <w:tblCaption w:val=""/>
+        <w:tblDescription w:val=""/>
+      </w:tblPr>
+      <w:tblGrid>
+        <w:gridCol w:w="1888"/>
+        <w:gridCol w:w="1650"/>
+        <w:gridCol w:w="1168"/>
+        <w:gridCol w:w="2071"/>
+        <w:gridCol w:w="1529"/>
+      </w:tblGrid>
+      <w:tr>
+        <w:tc>
+          <w:tcPr>
+            <w:tcW w:w="2081" w:type="dxa"/>
+            <w:tcBorders>
+              <w:top w:val="nil"/>
+              <w:left w:val="nil"/>
+              <w:bottom w:val="nil"/>
+              <w:right w:val="nil"/>
+            </w:tcBorders>
+            <w:tcMar>
+              <w:top w:w="80" w:type="dxa"/>
+              <w:left w:w="80" w:type="dxa"/>
+              <w:bottom w:w="80" w:type="dxa"/>
+              <w:right w:w="80" w:type="dxa"/>
+            </w:tcMar>
+            <w:hideMark/>
+          </w:tcPr>
+          <w:p>
+            <w:pPr>
+              <w:rPr>
+                <w:rFonts w:hint="eastAsia"/>
+              </w:rPr>
+            </w:pPr>
+            <w:r>
+              <w:rPr>
+                <w:rFonts w:hint="eastAsia"/>
+                <w:b/>
+                <w:bCs/>
+              </w:rPr>
+              <w:t>適應症</w:t>
+            </w:r>
+            <w:r>
+              <w:rPr>
+                <w:b/>
+                <w:bCs/>
+              </w:rPr>
+              <w:t xml:space="preserve"> / </w:t>
+            </w:r>
+            <w:r>
+              <w:rPr>
+                <w:rFonts w:hint="eastAsia"/>
+                <w:b/>
+                <w:bCs/>
+              </w:rPr>
+              <w:t>治療部位</w:t>
+            </w:r>
+          </w:p>
+        </w:tc>
+        <w:tc>
+          <w:tcPr>
+            <w:tcW w:w="2455" w:type="dxa"/>
+            <w:tcBorders>
+              <w:top w:val="nil"/>
+              <w:left w:val="nil"/>
+              <w:bottom w:val="nil"/>
+              <w:right w:val="nil"/>
+            </w:tcBorders>
+            <w:tcMar>
+              <w:top w:w="80" w:type="dxa"/>
+              <w:left w:w="80" w:type="dxa"/>
+              <w:bottom w:w="80" w:type="dxa"/>
+              <w:right w:w="80" w:type="dxa"/>
+            </w:tcMar>
+            <w:hideMark/>
+          </w:tcPr>
+          <w:p>
+            <w:r>
+              <w:rPr>
+                <w:rFonts w:hint="eastAsia"/>
+                <w:b/>
+                <w:bCs/>
+              </w:rPr>
+              <w:t>主要病理機制</w:t>
+            </w:r>
+          </w:p>
+        </w:tc>
+        <w:tc>
+          <w:tcPr>
+            <w:tcW w:w="1604" w:type="dxa"/>
+            <w:tcBorders>
+              <w:top w:val="nil"/>
+              <w:left w:val="nil"/>
+              <w:bottom w:val="nil"/>
+              <w:right w:val="nil"/>
+            </w:tcBorders>
+            <w:tcMar>
+              <w:top w:w="80" w:type="dxa"/>
+              <w:left w:w="80" w:type="dxa"/>
+              <w:bottom w:w="80" w:type="dxa"/>
+              <w:right w:w="80" w:type="dxa"/>
+            </w:tcMar>
+            <w:hideMark/>
+          </w:tcPr>
+          <w:p>
+            <w:pPr>
+              <w:rPr>
+                <w:rFonts w:hint="eastAsia"/>
+              </w:rPr>
+            </w:pPr>
+            <w:r>
+              <w:rPr>
+                <w:rFonts w:hint="eastAsia"/>
+                <w:b/>
+                <w:bCs/>
+              </w:rPr>
+              <w:t>主要栓塞血管標的</w:t>
+            </w:r>
+          </w:p>
+        </w:tc>
+        <w:tc>
+          <w:tcPr>
+            <w:tcW w:w="2942" w:type="dxa"/>
+            <w:tcBorders>
+              <w:top w:val="nil"/>
+              <w:left w:val="nil"/>
+              <w:bottom w:val="nil"/>
+              <w:right w:val="nil"/>
+            </w:tcBorders>
+            <w:tcMar>
+              <w:top w:w="80" w:type="dxa"/>
+              <w:left w:w="80" w:type="dxa"/>
+              <w:bottom w:w="80" w:type="dxa"/>
+              <w:right w:w="80" w:type="dxa"/>
+            </w:tcMar>
+            <w:hideMark/>
+          </w:tcPr>
+          <w:p>
+            <w:pPr>
+              <w:rPr>
+                <w:rFonts w:hint="eastAsia"/>
+              </w:rPr>
+            </w:pPr>
+            <w:r>
+              <w:rPr>
+                <w:rFonts w:hint="eastAsia"/>
+                <w:b/>
+                <w:bCs/>
+              </w:rPr>
+              <w:t>改善比例</w:t>
+            </w:r>
+            <w:r>
+              <w:rPr>
+                <w:b/>
+                <w:bCs/>
+              </w:rPr>
+              <w:t xml:space="preserve"> / </w:t>
+            </w:r>
+            <w:r>
+              <w:rPr>
+                <w:rFonts w:hint="eastAsia"/>
+                <w:b/>
+                <w:bCs/>
+              </w:rPr>
+              <w:t>臨床成效</w:t>
+            </w:r>
+          </w:p>
+        </w:tc>
+        <w:tc>
+          <w:tcPr>
+            <w:tcW w:w="1812" w:type="dxa"/>
+            <w:tcBorders>
+              <w:top w:val="nil"/>
+              <w:left w:val="nil"/>
+              <w:bottom w:val="nil"/>
+              <w:right w:val="nil"/>
+            </w:tcBorders>
+            <w:tcMar>
+              <w:top w:w="80" w:type="dxa"/>
+              <w:left w:w="80" w:type="dxa"/>
+              <w:bottom w:w="80" w:type="dxa"/>
+              <w:right w:w="80" w:type="dxa"/>
+            </w:tcMar>
+            <w:hideMark/>
+          </w:tcPr>
+          <w:p>
+            <w:r>
+              <w:rPr>
+                <w:rFonts w:hint="eastAsia"/>
+                <w:b/>
+                <w:bCs/>
+              </w:rPr>
+              <w:t>緩解時程</w:t>
+            </w:r>
+          </w:p>
+        </w:tc>
+      </w:tr>
+      <w:tr>
+        <w:tc>
+          <w:tcPr>
+            <w:tcW w:w="2110" w:type="dxa"/>
+            <w:tcBorders>
+              <w:top w:val="nil"/>
+              <w:left w:val="nil"/>
+              <w:bottom w:val="nil"/>
+              <w:right w:val="nil"/>
+            </w:tcBorders>
+            <w:tcMar>
+              <w:top w:w="80" w:type="dxa"/>
+              <w:left w:w="80" w:type="dxa"/>
+              <w:bottom w:w="80" w:type="dxa"/>
+              <w:right w:w="80" w:type="dxa"/>
+            </w:tcMar>
+            <w:hideMark/>
+          </w:tcPr>
+          <w:p>
+            <w:pPr>
+              <w:rPr>
+                <w:rFonts w:hint="eastAsia"/>
+              </w:rPr>
+            </w:pPr>
+            <w:r>
+              <w:rPr>
+                <w:rFonts w:hint="eastAsia"/>
+                <w:b/>
+                <w:bCs/>
+              </w:rPr>
+              <w:t>手部與指關節炎</w:t>
+            </w:r>
+            <w:r>
+              <w:t>(Finger / Thumb OA)</w:t>
+            </w:r>
+          </w:p>
+        </w:tc>
+        <w:tc>
+          <w:tcPr>
+            <w:tcW w:w="2484" w:type="dxa"/>
+            <w:tcBorders>
+              <w:top w:val="nil"/>
+              <w:left w:val="nil"/>
+              <w:bottom w:val="nil"/>
+              <w:right w:val="nil"/>
+            </w:tcBorders>
+            <w:tcMar>
+              <w:top w:w="80" w:type="dxa"/>
+              <w:left w:w="80" w:type="dxa"/>
+              <w:bottom w:w="80" w:type="dxa"/>
+              <w:right w:w="80" w:type="dxa"/>
+            </w:tcMar>
+            <w:hideMark/>
+          </w:tcPr>
+          <w:p>
+            <w:r>
+              <w:rPr>
+                <w:rFonts w:hint="eastAsia"/>
+              </w:rPr>
+              <w:t>腕掌關節或指間關節退化與滑膜炎生長異常血管</w:t>
+            </w:r>
+          </w:p>
+        </w:tc>
+        <w:tc>
+          <w:tcPr>
+            <w:tcW w:w="1604" w:type="dxa"/>
+            <w:tcBorders>
+              <w:top w:val="nil"/>
+              <w:left w:val="nil"/>
+              <w:bottom w:val="nil"/>
+              <w:right w:val="nil"/>
+            </w:tcBorders>
+            <w:tcMar>
+              <w:top w:w="80" w:type="dxa"/>
+              <w:left w:w="80" w:type="dxa"/>
+              <w:bottom w:w="80" w:type="dxa"/>
+              <w:right w:w="80" w:type="dxa"/>
+            </w:tcMar>
+            <w:hideMark/>
+          </w:tcPr>
+          <w:p>
+            <w:pPr>
+              <w:rPr>
+                <w:rFonts w:hint="eastAsia"/>
+              </w:rPr>
+            </w:pPr>
+            <w:r>
+              <w:rPr>
+                <w:rFonts w:hint="eastAsia"/>
+              </w:rPr>
+              <w:t>橈動脈、尺動脈分支</w:t>
+            </w:r>
+          </w:p>
+        </w:tc>
+        <w:tc>
+          <w:tcPr>
+            <w:tcW w:w="2969" w:type="dxa"/>
+            <w:tcBorders>
+              <w:top w:val="nil"/>
+              <w:left w:val="nil"/>
+              <w:bottom w:val="nil"/>
+              <w:right w:val="nil"/>
+            </w:tcBorders>
+            <w:tcMar>
+              <w:top w:w="80" w:type="dxa"/>
+              <w:left w:w="80" w:type="dxa"/>
+              <w:bottom w:w="80" w:type="dxa"/>
+              <w:right w:w="80" w:type="dxa"/>
+            </w:tcMar>
+            <w:hideMark/>
+          </w:tcPr>
+          <w:p>
+            <w:pPr>
+              <w:rPr>
+                <w:rFonts w:hint="eastAsia"/>
+              </w:rPr>
+            </w:pPr>
+            <w:r>
+              <w:rPr>
+                <w:rFonts w:hint="eastAsia"/>
+              </w:rPr>
+              <w:t>拇指基部關節炎治療成功率可達</w:t>
+            </w:r>
+            <w:r>
+              <w:t xml:space="preserve"> 100%</w:t>
+            </w:r>
+            <w:r>
+              <w:rPr>
+                <w:rFonts w:hint="eastAsia"/>
+              </w:rPr>
+              <w:t>；指間關節痛可降至</w:t>
+            </w:r>
+            <w:r>
+              <w:t xml:space="preserve"> 0 </w:t>
+            </w:r>
+            <w:r>
+              <w:rPr>
+                <w:rFonts w:hint="eastAsia"/>
+              </w:rPr>
+              <w:t>分</w:t>
+            </w:r>
+            <w:r>
+              <w:t>,</w:t>
+            </w:r>
+            <w:r>
+              <w:rPr>
+                <w:rFonts w:hint="eastAsia"/>
+              </w:rPr>
+              <w:t>。</w:t>
+            </w:r>
+          </w:p>
+        </w:tc>
+        <w:tc>
+          <w:tcPr>
+            <w:tcW w:w="2206" w:type="dxa"/>
+            <w:tcBorders>
+              <w:top w:val="nil"/>
+              <w:left w:val="nil"/>
+              <w:bottom w:val="nil"/>
+              <w:right w:val="nil"/>
+            </w:tcBorders>
+            <w:tcMar>
+              <w:top w:w="80" w:type="dxa"/>
+              <w:left w:w="80" w:type="dxa"/>
+              <w:bottom w:w="80" w:type="dxa"/>
+              <w:right w:w="80" w:type="dxa"/>
+            </w:tcMar>
+            <w:hideMark/>
+          </w:tcPr>
+          <w:p>
+            <w:r>
+              <w:rPr>
+                <w:rFonts w:hint="eastAsia"/>
+              </w:rPr>
+              <w:t>術後漸進改善，</w:t>
+            </w:r>
+            <w:r>
+              <w:t>1</w:t>
+            </w:r>
+            <w:r>
+              <w:rPr>
+                <w:rFonts w:hint="eastAsia"/>
+              </w:rPr>
+              <w:t>至</w:t>
+            </w:r>
+            <w:r>
+              <w:t>6</w:t>
+            </w:r>
+            <w:r>
+              <w:rPr>
+                <w:rFonts w:hint="eastAsia"/>
+              </w:rPr>
+              <w:t>個月內腫脹消退，療效長達</w:t>
+            </w:r>
+            <w:r>
+              <w:t xml:space="preserve"> 24 </w:t>
+            </w:r>
+            <w:r>
+              <w:rPr>
+                <w:rFonts w:hint="eastAsia"/>
+              </w:rPr>
+              <w:t>個月</w:t>
+            </w:r>
+            <w:r>
+              <w:t>,</w:t>
+            </w:r>
+            <w:r>
+              <w:rPr>
+                <w:rFonts w:hint="eastAsia"/>
+              </w:rPr>
+              <w:t>。</w:t>
+            </w:r>
+          </w:p>
+        </w:tc>
+      </w:tr>
+      <w:tr>
+        <w:tc>
+          <w:tcPr>
+            <w:tcW w:w="2081" w:type="dxa"/>
+            <w:tcBorders>
+              <w:top w:val="nil"/>
+              <w:left w:val="nil"/>
+              <w:bottom w:val="nil"/>
+              <w:right w:val="nil"/>
+            </w:tcBorders>
+            <w:tcMar>
+              <w:top w:w="80" w:type="dxa"/>
+              <w:left w:w="80" w:type="dxa"/>
+              <w:bottom w:w="80" w:type="dxa"/>
+              <w:right w:w="80" w:type="dxa"/>
+            </w:tcMar>
+            <w:hideMark/>
+          </w:tcPr>
+          <w:p>
+            <w:pPr>
+              <w:rPr>
+                <w:b/>
+                <w:bCs/>
+              </w:rPr>
+            </w:pPr>
+            <w:r>
+              <w:rPr>
+                <w:rFonts w:hint="eastAsia"/>
+                <w:b/>
+                <w:bCs/>
+              </w:rPr>
+              <w:t>狄奎凡氏症</w:t>
+            </w:r>
+            <w:r>
+              <w:rPr>
+                <w:b/>
+                <w:bCs/>
+              </w:rPr>
+              <w:t xml:space="preserve"> / </w:t>
+            </w:r>
+            <w:r>
+              <w:rPr>
+                <w:rFonts w:hint="eastAsia"/>
+                <w:b/>
+                <w:bCs/>
+              </w:rPr>
+              <w:t>媽媽手</w:t>
+            </w:r>
+          </w:p>
+          <w:p>
+            <w:r>
+              <w:t xml:space="preserve"> (De </w:t>
+            </w:r>
+            <w:proofErr w:type="spellStart"/>
+            <w:r>
+              <w:t>Quervain's</w:t>
+            </w:r>
+            <w:proofErr w:type="spellEnd"/>
+            <w:r>
+              <w:t xml:space="preserve"> Tenosynovitis)</w:t>
+            </w:r>
+          </w:p>
+        </w:tc>
+        <w:tc>
+          <w:tcPr>
+            <w:tcW w:w="2484" w:type="dxa"/>
+            <w:tcBorders>
+              <w:top w:val="nil"/>
+              <w:left w:val="nil"/>
+              <w:bottom w:val="nil"/>
+              <w:right w:val="nil"/>
+            </w:tcBorders>
+            <w:tcMar>
+              <w:top w:w="80" w:type="dxa"/>
+              <w:left w:w="80" w:type="dxa"/>
+              <w:bottom w:w="80" w:type="dxa"/>
+              <w:right w:w="80" w:type="dxa"/>
+            </w:tcMar>
+            <w:hideMark/>
+          </w:tcPr>
+          <w:p>
+            <w:r>
+              <w:rPr>
+                <w:rFonts w:hint="eastAsia"/>
+              </w:rPr>
+              <w:t>第一背側骨筋膜室肌腱慢性發炎、滑膜增厚與微血管過度增生</w:t>
+            </w:r>
+            <w:r>
+              <w:t>,</w:t>
+            </w:r>
+          </w:p>
+        </w:tc>
+        <w:tc>
+          <w:tcPr>
+            <w:tcW w:w="1604" w:type="dxa"/>
+            <w:tcBorders>
+              <w:top w:val="nil"/>
+              <w:left w:val="nil"/>
+              <w:bottom w:val="nil"/>
+              <w:right w:val="nil"/>
+            </w:tcBorders>
+            <w:tcMar>
+              <w:top w:w="80" w:type="dxa"/>
+              <w:left w:w="80" w:type="dxa"/>
+              <w:bottom w:w="80" w:type="dxa"/>
+              <w:right w:w="80" w:type="dxa"/>
+            </w:tcMar>
+            <w:hideMark/>
+          </w:tcPr>
+          <w:p>
+            <w:r>
+              <w:rPr>
+                <w:rFonts w:hint="eastAsia"/>
+              </w:rPr>
+              <w:t>橈動脈遠端分支</w:t>
+            </w:r>
+            <w:r>
+              <w:t>,</w:t>
+            </w:r>
+          </w:p>
+        </w:tc>
+        <w:tc>
+          <w:tcPr>
+            <w:tcW w:w="2969" w:type="dxa"/>
+            <w:tcBorders>
+              <w:top w:val="nil"/>
+              <w:left w:val="nil"/>
+              <w:bottom w:val="nil"/>
+              <w:right w:val="nil"/>
+            </w:tcBorders>
+            <w:tcMar>
+              <w:top w:w="80" w:type="dxa"/>
+              <w:left w:w="80" w:type="dxa"/>
+              <w:bottom w:w="80" w:type="dxa"/>
+              <w:right w:w="80" w:type="dxa"/>
+            </w:tcMar>
+            <w:hideMark/>
+          </w:tcPr>
+          <w:p>
+            <w:r>
+              <w:rPr>
+                <w:rFonts w:hint="eastAsia"/>
+              </w:rPr>
+              <w:t>術後局部疼痛完全緩解，關節活動無受限；</w:t>
+            </w:r>
+            <w:r>
+              <w:t xml:space="preserve">MRI </w:t>
+            </w:r>
+            <w:r>
+              <w:rPr>
+                <w:rFonts w:hint="eastAsia"/>
+              </w:rPr>
+              <w:t>顯示滑膜增厚與積水顯著改善</w:t>
+            </w:r>
+            <w:r>
+              <w:t>,</w:t>
+            </w:r>
+            <w:r>
+              <w:rPr>
+                <w:rFonts w:hint="eastAsia"/>
+              </w:rPr>
+              <w:t>。</w:t>
+            </w:r>
+          </w:p>
+        </w:tc>
+        <w:tc>
+          <w:tcPr>
+            <w:tcW w:w="2203" w:type="dxa"/>
+            <w:tcBorders>
+              <w:top w:val="nil"/>
+              <w:left w:val="nil"/>
+              <w:bottom w:val="nil"/>
+              <w:right w:val="nil"/>
+            </w:tcBorders>
+            <w:tcMar>
+              <w:top w:w="80" w:type="dxa"/>
+              <w:left w:w="80" w:type="dxa"/>
+              <w:bottom w:w="80" w:type="dxa"/>
+              <w:right w:w="80" w:type="dxa"/>
+            </w:tcMar>
+            <w:hideMark/>
+          </w:tcPr>
+          <w:p>
+            <w:r>
+              <w:rPr>
+                <w:rFonts w:hint="eastAsia"/>
+              </w:rPr>
+              <w:t>術後</w:t>
+            </w:r>
+            <w:r>
+              <w:t xml:space="preserve"> 3 </w:t>
+            </w:r>
+            <w:r>
+              <w:rPr>
+                <w:rFonts w:hint="eastAsia"/>
+              </w:rPr>
+              <w:t>個月內顯著改善並恢復正常手部功能</w:t>
+            </w:r>
+            <w:r>
+              <w:t>,</w:t>
+            </w:r>
+            <w:r>
+              <w:rPr>
+                <w:rFonts w:hint="eastAsia"/>
+              </w:rPr>
+              <w:t>。</w:t>
+            </w:r>
+          </w:p>
+        </w:tc>
+      </w:tr>
+      <w:tr>
+        <w:tc>
+          <w:tcPr>
+            <w:tcW w:w="2081" w:type="dxa"/>
+            <w:tcBorders>
+              <w:top w:val="nil"/>
+              <w:left w:val="nil"/>
+              <w:bottom w:val="nil"/>
+              <w:right w:val="nil"/>
+            </w:tcBorders>
+            <w:tcMar>
+              <w:top w:w="80" w:type="dxa"/>
+              <w:left w:w="80" w:type="dxa"/>
+              <w:bottom w:w="80" w:type="dxa"/>
+              <w:right w:w="80" w:type="dxa"/>
+            </w:tcMar>
+            <w:hideMark/>
+          </w:tcPr>
+          <w:p>
+            <w:r>
+              <w:rPr>
+                <w:rFonts w:hint="eastAsia"/>
+                <w:b/>
+                <w:bCs/>
+              </w:rPr>
+              <w:t>慢性蹠趾關節痛</w:t>
+            </w:r>
+            <w:r>
+              <w:t>(MTP Joint Pain)</w:t>
+            </w:r>
+          </w:p>
+        </w:tc>
+        <w:tc>
+          <w:tcPr>
+            <w:tcW w:w="2484" w:type="dxa"/>
+            <w:tcBorders>
+              <w:top w:val="nil"/>
+              <w:left w:val="nil"/>
+              <w:bottom w:val="nil"/>
+              <w:right w:val="nil"/>
+            </w:tcBorders>
+            <w:tcMar>
+              <w:top w:w="80" w:type="dxa"/>
+              <w:left w:w="80" w:type="dxa"/>
+              <w:bottom w:w="80" w:type="dxa"/>
+              <w:right w:w="80" w:type="dxa"/>
+            </w:tcMar>
+            <w:hideMark/>
+          </w:tcPr>
+          <w:p>
+            <w:r>
+              <w:rPr>
+                <w:rFonts w:hint="eastAsia"/>
+              </w:rPr>
+              <w:t>足部生物力學改變導致退化、發炎或結晶性關節病變</w:t>
+            </w:r>
+          </w:p>
+        </w:tc>
+        <w:tc>
+          <w:tcPr>
+            <w:tcW w:w="1604" w:type="dxa"/>
+            <w:tcBorders>
+              <w:top w:val="nil"/>
+              <w:left w:val="nil"/>
+              <w:bottom w:val="nil"/>
+              <w:right w:val="nil"/>
+            </w:tcBorders>
+            <w:tcMar>
+              <w:top w:w="80" w:type="dxa"/>
+              <w:left w:w="80" w:type="dxa"/>
+              <w:bottom w:w="80" w:type="dxa"/>
+              <w:right w:w="80" w:type="dxa"/>
+            </w:tcMar>
+            <w:hideMark/>
+          </w:tcPr>
+          <w:p>
+            <w:pPr>
+              <w:rPr>
+                <w:rFonts w:hint="eastAsia"/>
+              </w:rPr>
+            </w:pPr>
+            <w:r>
+              <w:rPr>
+                <w:rFonts w:hint="eastAsia"/>
+              </w:rPr>
+              <w:t>蹠骨動脈等末梢血管</w:t>
+            </w:r>
+          </w:p>
+        </w:tc>
+        <w:tc>
+          <w:tcPr>
+            <w:tcW w:w="2969" w:type="dxa"/>
+            <w:tcBorders>
+              <w:top w:val="nil"/>
+              <w:left w:val="nil"/>
+              <w:bottom w:val="nil"/>
+              <w:right w:val="nil"/>
+            </w:tcBorders>
+            <w:tcMar>
+              <w:top w:w="80" w:type="dxa"/>
+              <w:left w:w="80" w:type="dxa"/>
+              <w:bottom w:w="80" w:type="dxa"/>
+              <w:right w:w="80" w:type="dxa"/>
+            </w:tcMar>
+            <w:hideMark/>
+          </w:tcPr>
+          <w:p>
+            <w:pPr>
+              <w:rPr>
+                <w:rFonts w:hint="eastAsia"/>
+              </w:rPr>
+            </w:pPr>
+            <w:r>
+              <w:rPr>
+                <w:rFonts w:hint="eastAsia"/>
+              </w:rPr>
+              <w:t>疼痛指數</w:t>
+            </w:r>
+            <w:r>
+              <w:t xml:space="preserve"> (VAS) </w:t>
+            </w:r>
+            <w:r>
+              <w:rPr>
+                <w:rFonts w:hint="eastAsia"/>
+              </w:rPr>
+              <w:t>中位數下降高達</w:t>
+            </w:r>
+            <w:r>
+              <w:t xml:space="preserve"> 8 </w:t>
+            </w:r>
+            <w:r>
+              <w:rPr>
+                <w:rFonts w:hint="eastAsia"/>
+              </w:rPr>
+              <w:t>分，且患者對止痛藥需求降至</w:t>
+            </w:r>
+            <w:r>
+              <w:t xml:space="preserve"> 0</w:t>
+            </w:r>
+            <w:r>
+              <w:rPr>
+                <w:rFonts w:hint="eastAsia"/>
+              </w:rPr>
+              <w:t>。</w:t>
+            </w:r>
+          </w:p>
+        </w:tc>
+        <w:tc>
+          <w:tcPr>
+            <w:tcW w:w="2203" w:type="dxa"/>
+            <w:tcBorders>
+              <w:top w:val="nil"/>
+              <w:left w:val="nil"/>
+              <w:bottom w:val="nil"/>
+              <w:right w:val="nil"/>
+            </w:tcBorders>
+            <w:tcMar>
+              <w:top w:w="80" w:type="dxa"/>
+              <w:left w:w="80" w:type="dxa"/>
+              <w:bottom w:w="80" w:type="dxa"/>
+              <w:right w:w="80" w:type="dxa"/>
+            </w:tcMar>
+            <w:hideMark/>
+          </w:tcPr>
+          <w:p>
+            <w:r>
+              <w:rPr>
+                <w:rFonts w:hint="eastAsia"/>
+              </w:rPr>
+              <w:t>短期內顯著見效，追蹤</w:t>
+            </w:r>
+            <w:r>
+              <w:t xml:space="preserve"> 5 </w:t>
+            </w:r>
+            <w:r>
+              <w:rPr>
+                <w:rFonts w:hint="eastAsia"/>
+              </w:rPr>
+              <w:t>個月療效穩定。</w:t>
+            </w:r>
+          </w:p>
+        </w:tc>
+      </w:tr>
+      <w:tr>
+        <w:tc>
+          <w:tcPr>
+            <w:tcW w:w="2101" w:type="dxa"/>
+            <w:tcBorders>
+              <w:top w:val="nil"/>
+              <w:left w:val="nil"/>
+              <w:bottom w:val="nil"/>
+              <w:right w:val="nil"/>
+            </w:tcBorders>
+            <w:tcMar>
+              <w:top w:w="80" w:type="dxa"/>
+              <w:left w:w="80" w:type="dxa"/>
+              <w:bottom w:w="80" w:type="dxa"/>
+              <w:right w:w="80" w:type="dxa"/>
+            </w:tcMar>
+            <w:hideMark/>
+          </w:tcPr>
+          <w:p>
+            <w:r>
+              <w:rPr>
+                <w:rFonts w:hint="eastAsia"/>
+                <w:b/>
+                <w:bCs/>
+              </w:rPr>
+              <w:t>拇趾外翻疼痛</w:t>
+            </w:r>
+            <w:r>
+              <w:t>(Hallux Valgus Pain)</w:t>
+            </w:r>
+          </w:p>
+        </w:tc>
+        <w:tc>
+          <w:tcPr>
+            <w:tcW w:w="2484" w:type="dxa"/>
+            <w:tcBorders>
+              <w:top w:val="nil"/>
+              <w:left w:val="nil"/>
+              <w:bottom w:val="nil"/>
+              <w:right w:val="nil"/>
+            </w:tcBorders>
+            <w:tcMar>
+              <w:top w:w="80" w:type="dxa"/>
+              <w:left w:w="80" w:type="dxa"/>
+              <w:bottom w:w="80" w:type="dxa"/>
+              <w:right w:w="80" w:type="dxa"/>
+            </w:tcMar>
+            <w:hideMark/>
+          </w:tcPr>
+          <w:p>
+            <w:r>
+              <w:rPr>
+                <w:rFonts w:hint="eastAsia"/>
+              </w:rPr>
+              <w:t>第一蹠趾關節滑膜炎、軟組織發炎與異常新生血管</w:t>
+            </w:r>
+            <w:r>
+              <w:t>,</w:t>
+            </w:r>
+          </w:p>
+        </w:tc>
+        <w:tc>
+          <w:tcPr>
+            <w:tcW w:w="1604" w:type="dxa"/>
+            <w:tcBorders>
+              <w:top w:val="nil"/>
+              <w:left w:val="nil"/>
+              <w:bottom w:val="nil"/>
+              <w:right w:val="nil"/>
+            </w:tcBorders>
+            <w:tcMar>
+              <w:top w:w="80" w:type="dxa"/>
+              <w:left w:w="80" w:type="dxa"/>
+              <w:bottom w:w="80" w:type="dxa"/>
+              <w:right w:w="80" w:type="dxa"/>
+            </w:tcMar>
+            <w:hideMark/>
+          </w:tcPr>
+          <w:p>
+            <w:r>
+              <w:rPr>
+                <w:rFonts w:hint="eastAsia"/>
+              </w:rPr>
+              <w:t>前脛骨動脈、第一蹠骨底動脈</w:t>
+            </w:r>
+          </w:p>
+        </w:tc>
+        <w:tc>
+          <w:tcPr>
+            <w:tcW w:w="2969" w:type="dxa"/>
+            <w:tcBorders>
+              <w:top w:val="nil"/>
+              <w:left w:val="nil"/>
+              <w:bottom w:val="nil"/>
+              <w:right w:val="nil"/>
+            </w:tcBorders>
+            <w:tcMar>
+              <w:top w:w="80" w:type="dxa"/>
+              <w:left w:w="80" w:type="dxa"/>
+              <w:bottom w:w="80" w:type="dxa"/>
+              <w:right w:w="80" w:type="dxa"/>
+            </w:tcMar>
+            <w:hideMark/>
+          </w:tcPr>
+          <w:p>
+            <w:pPr>
+              <w:rPr>
+                <w:rFonts w:hint="eastAsia"/>
+              </w:rPr>
+            </w:pPr>
+            <w:r>
+              <w:rPr>
+                <w:rFonts w:hint="eastAsia"/>
+              </w:rPr>
+              <w:t>疼痛分數</w:t>
+            </w:r>
+            <w:r>
+              <w:t xml:space="preserve"> (VAS) </w:t>
+            </w:r>
+            <w:r>
+              <w:rPr>
+                <w:rFonts w:hint="eastAsia"/>
+              </w:rPr>
+              <w:t>由</w:t>
+            </w:r>
+            <w:r>
+              <w:t xml:space="preserve"> 8 </w:t>
+            </w:r>
+            <w:r>
+              <w:rPr>
+                <w:rFonts w:hint="eastAsia"/>
+              </w:rPr>
+              <w:t>分大幅降至</w:t>
+            </w:r>
+            <w:r>
+              <w:t xml:space="preserve"> 2 </w:t>
+            </w:r>
+            <w:r>
+              <w:rPr>
+                <w:rFonts w:hint="eastAsia"/>
+              </w:rPr>
+              <w:t>分，避免了傳統矯正手術。</w:t>
+            </w:r>
+          </w:p>
+        </w:tc>
+        <w:tc>
+          <w:tcPr>
+            <w:tcW w:w="2203" w:type="dxa"/>
+            <w:tcBorders>
+              <w:top w:val="nil"/>
+              <w:left w:val="nil"/>
+              <w:bottom w:val="nil"/>
+              <w:right w:val="nil"/>
+            </w:tcBorders>
+            <w:tcMar>
+              <w:top w:w="80" w:type="dxa"/>
+              <w:left w:w="80" w:type="dxa"/>
+              <w:bottom w:w="80" w:type="dxa"/>
+              <w:right w:w="80" w:type="dxa"/>
+            </w:tcMar>
+            <w:hideMark/>
+          </w:tcPr>
+          <w:p>
+            <w:r>
+              <w:rPr>
+                <w:rFonts w:hint="eastAsia"/>
+              </w:rPr>
+              <w:t>術後</w:t>
+            </w:r>
+            <w:r>
+              <w:t xml:space="preserve"> 2 </w:t>
+            </w:r>
+            <w:r>
+              <w:rPr>
+                <w:rFonts w:hint="eastAsia"/>
+              </w:rPr>
+              <w:t>週至</w:t>
+            </w:r>
+            <w:r>
+              <w:t xml:space="preserve"> 2 </w:t>
+            </w:r>
+            <w:r>
+              <w:rPr>
+                <w:rFonts w:hint="eastAsia"/>
+              </w:rPr>
+              <w:t>個月內顯著改善，且無缺血壞死副作用。</w:t>
+            </w:r>
+          </w:p>
+        </w:tc>
+      </w:tr>
+      <w:tr>
+        <w:tc>
+          <w:tcPr>
+            <w:tcW w:w="2110" w:type="dxa"/>
+            <w:tcBorders>
+              <w:top w:val="nil"/>
+              <w:left w:val="nil"/>
+              <w:bottom w:val="nil"/>
+              <w:right w:val="nil"/>
+            </w:tcBorders>
+            <w:tcMar>
+              <w:top w:w="80" w:type="dxa"/>
+              <w:left w:w="80" w:type="dxa"/>
+              <w:bottom w:w="80" w:type="dxa"/>
+              <w:right w:w="80" w:type="dxa"/>
+            </w:tcMar>
+            <w:hideMark/>
+          </w:tcPr>
+          <w:p>
+            <w:r>
+              <w:rPr>
+                <w:rFonts w:hint="eastAsia"/>
+                <w:b/>
+                <w:bCs/>
+              </w:rPr>
+              <w:t>足底筋膜炎</w:t>
+            </w:r>
+            <w:r>
+              <w:lastRenderedPageBreak/>
+              <w:t>(Plantar Fasciitis)</w:t>
+            </w:r>
+          </w:p>
+        </w:tc>
+        <w:tc>
+          <w:tcPr>
+            <w:tcW w:w="2484" w:type="dxa"/>
+            <w:tcBorders>
+              <w:top w:val="nil"/>
+              <w:left w:val="nil"/>
+              <w:bottom w:val="nil"/>
+              <w:right w:val="nil"/>
+            </w:tcBorders>
+            <w:tcMar>
+              <w:top w:w="80" w:type="dxa"/>
+              <w:left w:w="80" w:type="dxa"/>
+              <w:bottom w:w="80" w:type="dxa"/>
+              <w:right w:w="80" w:type="dxa"/>
+            </w:tcMar>
+            <w:hideMark/>
+          </w:tcPr>
+          <w:p>
+            <w:r>
+              <w:rPr>
+                <w:rFonts w:hint="eastAsia"/>
+              </w:rPr>
+              <w:lastRenderedPageBreak/>
+              <w:t>足底筋膜與周</w:t>
+            </w:r>
+            <w:r>
+              <w:rPr>
+                <w:rFonts w:hint="eastAsia"/>
+              </w:rPr>
+              <w:lastRenderedPageBreak/>
+              <w:t>邊結構退化、過度使用產生異常血流</w:t>
+            </w:r>
+          </w:p>
+        </w:tc>
+        <w:tc>
+          <w:tcPr>
+            <w:tcW w:w="1604" w:type="dxa"/>
+            <w:tcBorders>
+              <w:top w:val="nil"/>
+              <w:left w:val="nil"/>
+              <w:bottom w:val="nil"/>
+              <w:right w:val="nil"/>
+            </w:tcBorders>
+            <w:tcMar>
+              <w:top w:w="80" w:type="dxa"/>
+              <w:left w:w="80" w:type="dxa"/>
+              <w:bottom w:w="80" w:type="dxa"/>
+              <w:right w:w="80" w:type="dxa"/>
+            </w:tcMar>
+            <w:hideMark/>
+          </w:tcPr>
+          <w:p>
+            <w:pPr>
+              <w:rPr>
+                <w:rFonts w:hint="eastAsia"/>
+              </w:rPr>
+            </w:pPr>
+            <w:r>
+              <w:rPr>
+                <w:rFonts w:hint="eastAsia"/>
+              </w:rPr>
+              <w:lastRenderedPageBreak/>
+              <w:t>後脛骨動</w:t>
+            </w:r>
+            <w:r>
+              <w:rPr>
+                <w:rFonts w:hint="eastAsia"/>
+              </w:rPr>
+              <w:lastRenderedPageBreak/>
+              <w:t>脈、腓骨動脈</w:t>
+            </w:r>
+          </w:p>
+        </w:tc>
+        <w:tc>
+          <w:tcPr>
+            <w:tcW w:w="2969" w:type="dxa"/>
+            <w:tcBorders>
+              <w:top w:val="nil"/>
+              <w:left w:val="nil"/>
+              <w:bottom w:val="nil"/>
+              <w:right w:val="nil"/>
+            </w:tcBorders>
+            <w:tcMar>
+              <w:top w:w="80" w:type="dxa"/>
+              <w:left w:w="80" w:type="dxa"/>
+              <w:bottom w:w="80" w:type="dxa"/>
+              <w:right w:w="80" w:type="dxa"/>
+            </w:tcMar>
+            <w:hideMark/>
+          </w:tcPr>
+          <w:p>
+            <w:pPr>
+              <w:rPr>
+                <w:rFonts w:hint="eastAsia"/>
+              </w:rPr>
+            </w:pPr>
+            <w:r>
+              <w:rPr>
+                <w:rFonts w:hint="eastAsia"/>
+              </w:rPr>
+              <w:lastRenderedPageBreak/>
+              <w:t>疼痛分數由嚴重</w:t>
+            </w:r>
+            <w:r>
+              <w:rPr>
+                <w:rFonts w:hint="eastAsia"/>
+              </w:rPr>
+              <w:lastRenderedPageBreak/>
+              <w:t>疼痛顯著降至幾乎無痛，恢復正常生活。</w:t>
+            </w:r>
+          </w:p>
+        </w:tc>
+        <w:tc>
+          <w:tcPr>
+            <w:tcW w:w="2195" w:type="dxa"/>
+            <w:tcBorders>
+              <w:top w:val="nil"/>
+              <w:left w:val="nil"/>
+              <w:bottom w:val="nil"/>
+              <w:right w:val="nil"/>
+            </w:tcBorders>
+            <w:tcMar>
+              <w:top w:w="80" w:type="dxa"/>
+              <w:left w:w="80" w:type="dxa"/>
+              <w:bottom w:w="80" w:type="dxa"/>
+              <w:right w:w="80" w:type="dxa"/>
+            </w:tcMar>
+            <w:hideMark/>
+          </w:tcPr>
+          <w:p>
+            <w:pPr>
+              <w:rPr>
+                <w:rFonts w:hint="eastAsia"/>
+              </w:rPr>
+            </w:pPr>
+            <w:r>
+              <w:rPr>
+                <w:rFonts w:hint="eastAsia"/>
+              </w:rPr>
+              <w:lastRenderedPageBreak/>
+              <w:t>術後</w:t>
+            </w:r>
+            <w:r>
+              <w:t xml:space="preserve"> 1 </w:t>
+            </w:r>
+            <w:r>
+              <w:rPr>
+                <w:rFonts w:hint="eastAsia"/>
+              </w:rPr>
+              <w:t>週內</w:t>
+            </w:r>
+            <w:r>
+              <w:rPr>
+                <w:rFonts w:hint="eastAsia"/>
+              </w:rPr>
+              <w:lastRenderedPageBreak/>
+              <w:t>疼痛開始減輕，</w:t>
+            </w:r>
+            <w:r>
+              <w:t xml:space="preserve">3 </w:t>
+            </w:r>
+            <w:r>
+              <w:rPr>
+                <w:rFonts w:hint="eastAsia"/>
+              </w:rPr>
+              <w:t>個月恢復正常活動。</w:t>
+            </w:r>
+          </w:p>
+        </w:tc>
+      </w:tr>
+    </w:tbl>
+    <w:p>
+      <w:r>
+        <w:lastRenderedPageBreak/>
+        <w:t> </w:t>
+      </w:r>
+    </w:p>
+    <w:p>
+      <w:r>
+        <w:rPr>
+          <w:rFonts w:hint="eastAsia"/>
+          <w:b/>
+          <w:bCs/>
+        </w:rPr>
+        <w:t>表二：建議以傳統</w:t>
+      </w:r>
+      <w:r>
+        <w:rPr>
+          <w:b/>
+          <w:bCs/>
+        </w:rPr>
+        <w:t xml:space="preserve"> TAME (</w:t>
+      </w:r>
+      <w:r>
+        <w:rPr>
+          <w:rFonts w:hint="eastAsia"/>
+          <w:b/>
+          <w:bCs/>
+        </w:rPr>
+        <w:t>標準影像導引</w:t>
+      </w:r>
+      <w:r>
+        <w:rPr>
+          <w:b/>
+          <w:bCs/>
+        </w:rPr>
+        <w:t xml:space="preserve">) </w:t>
+      </w:r>
+      <w:r>
+        <w:rPr>
+          <w:rFonts w:hint="eastAsia"/>
+          <w:b/>
+          <w:bCs/>
+        </w:rPr>
+        <w:t>進行的適應症</w:t>
+      </w:r>
+    </w:p>
+    <w:p>
+      <w:r>
+        <w:rPr>
+          <w:rFonts w:hint="eastAsia"/>
+        </w:rPr>
+        <w:t>這些部位的血管較深層、分支複雜或影響範圍廣泛，通常需要標準</w:t>
+      </w:r>
+      <w:r>
+        <w:t xml:space="preserve"> X </w:t>
+      </w:r>
+      <w:r>
+        <w:rPr>
+          <w:rFonts w:hint="eastAsia"/>
+        </w:rPr>
+        <w:t>光血管攝影</w:t>
+      </w:r>
+      <w:r>
+        <w:t xml:space="preserve"> (DSA) </w:t>
+      </w:r>
+      <w:r>
+        <w:rPr>
+          <w:rFonts w:hint="eastAsia"/>
+        </w:rPr>
+        <w:t>設備來精準辨識異常血管並避免誤栓正常組織。</w:t>
+      </w:r>
+    </w:p>
+    <w:tbl>
+      <w:tblPr>
+        <w:tblW w:w="0" w:type="auto"/>
+        <w:tblBorders>
+          <w:top w:val="single" w:sz="2" w:space="0" w:color="A3A3A3"/>
+          <w:left w:val="single" w:sz="2" w:space="0" w:color="A3A3A3"/>
+          <w:bottom w:val="single" w:sz="2" w:space="0" w:color="A3A3A3"/>
+          <w:right w:val="single" w:sz="2" w:space="0" w:color="A3A3A3"/>
+        </w:tblBorders>
+        <w:tblCellMar>
+          <w:left w:w="0" w:type="dxa"/>
+          <w:right w:w="0" w:type="dxa"/>
+        </w:tblCellMar>
+        <w:tblLook w:val="04A0" w:firstRow="1" w:lastRow="0" w:firstColumn="1" w:lastColumn="0" w:noHBand="0" w:noVBand="1"/>
+        <w:tblCaption w:val=""/>
+        <w:tblDescription w:val=""/>
+      </w:tblPr>
+      <w:tblGrid>
+        <w:gridCol w:w="1900"/>
+        <w:gridCol w:w="1524"/>
+        <w:gridCol w:w="1467"/>
+        <w:gridCol w:w="1857"/>
+        <w:gridCol w:w="1558"/>
+      </w:tblGrid>
+      <w:tr>
+        <w:tc>
+          <w:tcPr>
+            <w:tcW w:w="2146" w:type="dxa"/>
+            <w:tcBorders>
+              <w:top w:val="nil"/>
+              <w:left w:val="nil"/>
+              <w:bottom w:val="nil"/>
+              <w:right w:val="nil"/>
+            </w:tcBorders>
+            <w:tcMar>
+              <w:top w:w="80" w:type="dxa"/>
+              <w:left w:w="80" w:type="dxa"/>
+              <w:bottom w:w="80" w:type="dxa"/>
+              <w:right w:w="80" w:type="dxa"/>
+            </w:tcMar>
+            <w:hideMark/>
+          </w:tcPr>
+          <w:p>
+            <w:r>
+              <w:rPr>
+                <w:rFonts w:hint="eastAsia"/>
+                <w:b/>
+                <w:bCs/>
+              </w:rPr>
+              <w:t>適應症</w:t>
+            </w:r>
+            <w:r>
+              <w:rPr>
+                <w:b/>
+                <w:bCs/>
+              </w:rPr>
+              <w:t xml:space="preserve"> / </w:t>
+            </w:r>
+            <w:r>
+              <w:rPr>
+                <w:rFonts w:hint="eastAsia"/>
+                <w:b/>
+                <w:bCs/>
+              </w:rPr>
+              <w:t>治療部位</w:t>
+            </w:r>
+          </w:p>
+        </w:tc>
+        <w:tc>
+          <w:tcPr>
+            <w:tcW w:w="2173" w:type="dxa"/>
+            <w:tcBorders>
+              <w:top w:val="nil"/>
+              <w:left w:val="nil"/>
+              <w:bottom w:val="nil"/>
+              <w:right w:val="nil"/>
+            </w:tcBorders>
+            <w:tcMar>
+              <w:top w:w="80" w:type="dxa"/>
+              <w:left w:w="80" w:type="dxa"/>
+              <w:bottom w:w="80" w:type="dxa"/>
+              <w:right w:w="80" w:type="dxa"/>
+            </w:tcMar>
+            <w:hideMark/>
+          </w:tcPr>
+          <w:p>
+            <w:r>
+              <w:rPr>
+                <w:rFonts w:hint="eastAsia"/>
+                <w:b/>
+                <w:bCs/>
+              </w:rPr>
+              <w:t>主要病理機制</w:t>
+            </w:r>
+          </w:p>
+        </w:tc>
+        <w:tc>
+          <w:tcPr>
+            <w:tcW w:w="1719" w:type="dxa"/>
+            <w:tcBorders>
+              <w:top w:val="nil"/>
+              <w:left w:val="nil"/>
+              <w:bottom w:val="nil"/>
+              <w:right w:val="nil"/>
+            </w:tcBorders>
+            <w:tcMar>
+              <w:top w:w="80" w:type="dxa"/>
+              <w:left w:w="80" w:type="dxa"/>
+              <w:bottom w:w="80" w:type="dxa"/>
+              <w:right w:w="80" w:type="dxa"/>
+            </w:tcMar>
+            <w:hideMark/>
+          </w:tcPr>
+          <w:p>
+            <w:pPr>
+              <w:rPr>
+                <w:rFonts w:hint="eastAsia"/>
+              </w:rPr>
+            </w:pPr>
+            <w:r>
+              <w:rPr>
+                <w:rFonts w:hint="eastAsia"/>
+                <w:b/>
+                <w:bCs/>
+              </w:rPr>
+              <w:t>主要栓塞血管標的</w:t>
+            </w:r>
+          </w:p>
+        </w:tc>
+        <w:tc>
+          <w:tcPr>
+            <w:tcW w:w="2759" w:type="dxa"/>
+            <w:tcBorders>
+              <w:top w:val="nil"/>
+              <w:left w:val="nil"/>
+              <w:bottom w:val="nil"/>
+              <w:right w:val="nil"/>
+            </w:tcBorders>
+            <w:tcMar>
+              <w:top w:w="80" w:type="dxa"/>
+              <w:left w:w="80" w:type="dxa"/>
+              <w:bottom w:w="80" w:type="dxa"/>
+              <w:right w:w="80" w:type="dxa"/>
+            </w:tcMar>
+            <w:hideMark/>
+          </w:tcPr>
+          <w:p>
+            <w:pPr>
+              <w:rPr>
+                <w:rFonts w:hint="eastAsia"/>
+              </w:rPr>
+            </w:pPr>
+            <w:r>
+              <w:rPr>
+                <w:rFonts w:hint="eastAsia"/>
+                <w:b/>
+                <w:bCs/>
+              </w:rPr>
+              <w:t>改善比例</w:t>
+            </w:r>
+            <w:r>
+              <w:rPr>
+                <w:b/>
+                <w:bCs/>
+              </w:rPr>
+              <w:t xml:space="preserve"> / </w:t>
+            </w:r>
+            <w:r>
+              <w:rPr>
+                <w:rFonts w:hint="eastAsia"/>
+                <w:b/>
+                <w:bCs/>
+              </w:rPr>
+              <w:t>臨床成效</w:t>
+            </w:r>
+          </w:p>
+        </w:tc>
+        <w:tc>
+          <w:tcPr>
+            <w:tcW w:w="2095" w:type="dxa"/>
+            <w:tcBorders>
+              <w:top w:val="nil"/>
+              <w:left w:val="nil"/>
+              <w:bottom w:val="nil"/>
+              <w:right w:val="nil"/>
+            </w:tcBorders>
+            <w:tcMar>
+              <w:top w:w="80" w:type="dxa"/>
+              <w:left w:w="80" w:type="dxa"/>
+              <w:bottom w:w="80" w:type="dxa"/>
+              <w:right w:w="80" w:type="dxa"/>
+            </w:tcMar>
+            <w:hideMark/>
+          </w:tcPr>
+          <w:p>
+            <w:r>
+              <w:rPr>
+                <w:rFonts w:hint="eastAsia"/>
+                <w:b/>
+                <w:bCs/>
+              </w:rPr>
+              <w:t>緩解時程</w:t>
+            </w:r>
+          </w:p>
+        </w:tc>
+      </w:tr>
+      <w:tr>
+        <w:tc>
+          <w:tcPr>
+            <w:tcW w:w="2173" w:type="dxa"/>
+            <w:tcBorders>
+              <w:top w:val="nil"/>
+              <w:left w:val="nil"/>
+              <w:bottom w:val="nil"/>
+              <w:right w:val="nil"/>
+            </w:tcBorders>
+            <w:tcMar>
+              <w:top w:w="80" w:type="dxa"/>
+              <w:left w:w="80" w:type="dxa"/>
+              <w:bottom w:w="80" w:type="dxa"/>
+              <w:right w:w="80" w:type="dxa"/>
+            </w:tcMar>
+            <w:hideMark/>
+          </w:tcPr>
+          <w:p>
+            <w:pPr>
+              <w:rPr>
+                <w:rFonts w:hint="eastAsia"/>
+              </w:rPr>
+            </w:pPr>
+            <w:r>
+              <w:rPr>
+                <w:rFonts w:hint="eastAsia"/>
+                <w:b/>
+                <w:bCs/>
+              </w:rPr>
+              <w:t>退化性膝關節炎</w:t>
+            </w:r>
+            <w:r>
+              <w:t>(Knee Osteoarthritis)</w:t>
+            </w:r>
+          </w:p>
+        </w:tc>
+        <w:tc>
+          <w:tcPr>
+            <w:tcW w:w="2173" w:type="dxa"/>
+            <w:tcBorders>
+              <w:top w:val="nil"/>
+              <w:left w:val="nil"/>
+              <w:bottom w:val="nil"/>
+              <w:right w:val="nil"/>
+            </w:tcBorders>
+            <w:tcMar>
+              <w:top w:w="80" w:type="dxa"/>
+              <w:left w:w="80" w:type="dxa"/>
+              <w:bottom w:w="80" w:type="dxa"/>
+              <w:right w:w="80" w:type="dxa"/>
+            </w:tcMar>
+            <w:hideMark/>
+          </w:tcPr>
+          <w:p>
+            <w:r>
+              <w:rPr>
+                <w:rFonts w:hint="eastAsia"/>
+              </w:rPr>
+              <w:t>慢性滑膜炎、軟骨下骨髓病變</w:t>
+            </w:r>
+            <w:r>
+              <w:t xml:space="preserve"> (BMLs),</w:t>
+            </w:r>
+          </w:p>
+        </w:tc>
+        <w:tc>
+          <w:tcPr>
+            <w:tcW w:w="1719" w:type="dxa"/>
+            <w:tcBorders>
+              <w:top w:val="nil"/>
+              <w:left w:val="nil"/>
+              <w:bottom w:val="nil"/>
+              <w:right w:val="nil"/>
+            </w:tcBorders>
+            <w:tcMar>
+              <w:top w:w="80" w:type="dxa"/>
+              <w:left w:w="80" w:type="dxa"/>
+              <w:bottom w:w="80" w:type="dxa"/>
+              <w:right w:w="80" w:type="dxa"/>
+            </w:tcMar>
+            <w:hideMark/>
+          </w:tcPr>
+          <w:p>
+            <w:r>
+              <w:rPr>
+                <w:rFonts w:hint="eastAsia"/>
+              </w:rPr>
+              <w:t>膝部動脈分支</w:t>
+            </w:r>
+            <w:r>
+              <w:t xml:space="preserve"> (Genicular Arteries),</w:t>
+            </w:r>
+          </w:p>
+        </w:tc>
+        <w:tc>
+          <w:tcPr>
+            <w:tcW w:w="2759" w:type="dxa"/>
+            <w:tcBorders>
+              <w:top w:val="nil"/>
+              <w:left w:val="nil"/>
+              <w:bottom w:val="nil"/>
+              <w:right w:val="nil"/>
+            </w:tcBorders>
+            <w:tcMar>
+              <w:top w:w="80" w:type="dxa"/>
+              <w:left w:w="80" w:type="dxa"/>
+              <w:bottom w:w="80" w:type="dxa"/>
+              <w:right w:w="80" w:type="dxa"/>
+            </w:tcMar>
+            <w:hideMark/>
+          </w:tcPr>
+          <w:p>
+            <w:r>
+              <w:rPr>
+                <w:rFonts w:hint="eastAsia"/>
+              </w:rPr>
+              <w:t>治療後</w:t>
+            </w:r>
+            <w:r>
+              <w:t xml:space="preserve"> 6 </w:t>
+            </w:r>
+            <w:r>
+              <w:rPr>
+                <w:rFonts w:hint="eastAsia"/>
+              </w:rPr>
+              <w:t>個月成功率達</w:t>
+            </w:r>
+            <w:r>
+              <w:t xml:space="preserve"> 86.3%</w:t>
+            </w:r>
+            <w:r>
+              <w:rPr>
+                <w:rFonts w:hint="eastAsia"/>
+              </w:rPr>
+              <w:t>；</w:t>
+            </w:r>
+            <w:r>
+              <w:t xml:space="preserve">3 </w:t>
+            </w:r>
+            <w:r>
+              <w:rPr>
+                <w:rFonts w:hint="eastAsia"/>
+              </w:rPr>
+              <w:t>年後仍有</w:t>
+            </w:r>
+            <w:r>
+              <w:t xml:space="preserve"> 79.8% </w:t>
+            </w:r>
+            <w:r>
+              <w:rPr>
+                <w:rFonts w:hint="eastAsia"/>
+              </w:rPr>
+              <w:t>維持療效。</w:t>
+            </w:r>
+          </w:p>
+        </w:tc>
+        <w:tc>
+          <w:tcPr>
+            <w:tcW w:w="2424" w:type="dxa"/>
+            <w:tcBorders>
+              <w:top w:val="nil"/>
+              <w:left w:val="nil"/>
+              <w:bottom w:val="nil"/>
+              <w:right w:val="nil"/>
+            </w:tcBorders>
+            <w:tcMar>
+              <w:top w:w="80" w:type="dxa"/>
+              <w:left w:w="80" w:type="dxa"/>
+              <w:bottom w:w="80" w:type="dxa"/>
+              <w:right w:w="80" w:type="dxa"/>
+            </w:tcMar>
+            <w:hideMark/>
+          </w:tcPr>
+          <w:p>
+            <w:r>
+              <w:rPr>
+                <w:rFonts w:hint="eastAsia"/>
+              </w:rPr>
+              <w:t>術後</w:t>
+            </w:r>
+            <w:r>
+              <w:t xml:space="preserve"> 1 </w:t>
+            </w:r>
+            <w:r>
+              <w:rPr>
+                <w:rFonts w:hint="eastAsia"/>
+              </w:rPr>
+              <w:t>至</w:t>
+            </w:r>
+            <w:r>
+              <w:t xml:space="preserve"> 4 </w:t>
+            </w:r>
+            <w:r>
+              <w:rPr>
+                <w:rFonts w:hint="eastAsia"/>
+              </w:rPr>
+              <w:t>個月內疼痛顯著下降，效果可持續數年。</w:t>
+            </w:r>
+          </w:p>
+        </w:tc>
+      </w:tr>
+      <w:tr>
+        <w:tc>
+          <w:tcPr>
+            <w:tcW w:w="2146" w:type="dxa"/>
+            <w:tcBorders>
+              <w:top w:val="nil"/>
+              <w:left w:val="nil"/>
+              <w:bottom w:val="nil"/>
+              <w:right w:val="nil"/>
+            </w:tcBorders>
+            <w:tcMar>
+              <w:top w:w="80" w:type="dxa"/>
+              <w:left w:w="80" w:type="dxa"/>
+              <w:bottom w:w="80" w:type="dxa"/>
+              <w:right w:w="80" w:type="dxa"/>
+            </w:tcMar>
+            <w:hideMark/>
+          </w:tcPr>
+          <w:p>
+            <w:r>
+              <w:rPr>
+                <w:rFonts w:hint="eastAsia"/>
+                <w:b/>
+                <w:bCs/>
+              </w:rPr>
+              <w:t>沾黏性肩關節囊炎</w:t>
+            </w:r>
+            <w:r>
+              <w:t>(</w:t>
+            </w:r>
+            <w:r>
+              <w:rPr>
+                <w:rFonts w:hint="eastAsia"/>
+              </w:rPr>
+              <w:t>五十肩</w:t>
+            </w:r>
+            <w:r>
+              <w:t xml:space="preserve"> / Frozen Shoulder)</w:t>
+            </w:r>
+          </w:p>
+        </w:tc>
+        <w:tc>
+          <w:tcPr>
+            <w:tcW w:w="2173" w:type="dxa"/>
+            <w:tcBorders>
+              <w:top w:val="nil"/>
+              <w:left w:val="nil"/>
+              <w:bottom w:val="nil"/>
+              <w:right w:val="nil"/>
+            </w:tcBorders>
+            <w:tcMar>
+              <w:top w:w="80" w:type="dxa"/>
+              <w:left w:w="80" w:type="dxa"/>
+              <w:bottom w:w="80" w:type="dxa"/>
+              <w:right w:w="80" w:type="dxa"/>
+            </w:tcMar>
+            <w:hideMark/>
+          </w:tcPr>
+          <w:p>
+            <w:r>
+              <w:rPr>
+                <w:rFonts w:hint="eastAsia"/>
+              </w:rPr>
+              <w:t>關節囊發炎、纖維化與異常血管神經增生</w:t>
+            </w:r>
+          </w:p>
+        </w:tc>
+        <w:tc>
+          <w:tcPr>
+            <w:tcW w:w="1719" w:type="dxa"/>
+            <w:tcBorders>
+              <w:top w:val="nil"/>
+              <w:left w:val="nil"/>
+              <w:bottom w:val="nil"/>
+              <w:right w:val="nil"/>
+            </w:tcBorders>
+            <w:tcMar>
+              <w:top w:w="80" w:type="dxa"/>
+              <w:left w:w="80" w:type="dxa"/>
+              <w:bottom w:w="80" w:type="dxa"/>
+              <w:right w:w="80" w:type="dxa"/>
+            </w:tcMar>
+            <w:hideMark/>
+          </w:tcPr>
+          <w:p>
+            <w:pPr>
+              <w:rPr>
+                <w:rFonts w:hint="eastAsia"/>
+              </w:rPr>
+            </w:pPr>
+            <w:r>
+              <w:rPr>
+                <w:rFonts w:hint="eastAsia"/>
+              </w:rPr>
+              <w:t>胸肩峰動脈、上肩胛動脈等</w:t>
+            </w:r>
+            <w:r>
+              <w:t>,</w:t>
+            </w:r>
+          </w:p>
+        </w:tc>
+        <w:tc>
+          <w:tcPr>
+            <w:tcW w:w="2759" w:type="dxa"/>
+            <w:tcBorders>
+              <w:top w:val="nil"/>
+              <w:left w:val="nil"/>
+              <w:bottom w:val="nil"/>
+              <w:right w:val="nil"/>
+            </w:tcBorders>
+            <w:tcMar>
+              <w:top w:w="80" w:type="dxa"/>
+              <w:left w:w="80" w:type="dxa"/>
+              <w:bottom w:w="80" w:type="dxa"/>
+              <w:right w:w="80" w:type="dxa"/>
+            </w:tcMar>
+            <w:hideMark/>
+          </w:tcPr>
+          <w:p>
+            <w:r>
+              <w:t xml:space="preserve">3 </w:t>
+            </w:r>
+            <w:r>
+              <w:rPr>
+                <w:rFonts w:hint="eastAsia"/>
+              </w:rPr>
+              <w:t>個月臨床成功率</w:t>
+            </w:r>
+            <w:r>
+              <w:t xml:space="preserve"> 84%</w:t>
+            </w:r>
+            <w:r>
+              <w:rPr>
+                <w:rFonts w:hint="eastAsia"/>
+              </w:rPr>
+              <w:t>；術後</w:t>
+            </w:r>
+            <w:r>
+              <w:t xml:space="preserve"> 1 </w:t>
+            </w:r>
+            <w:r>
+              <w:rPr>
+                <w:rFonts w:hint="eastAsia"/>
+              </w:rPr>
+              <w:t>至</w:t>
+            </w:r>
+            <w:r>
+              <w:t xml:space="preserve"> 3 </w:t>
+            </w:r>
+            <w:r>
+              <w:rPr>
+                <w:rFonts w:hint="eastAsia"/>
+              </w:rPr>
+              <w:t>年有</w:t>
+            </w:r>
+            <w:r>
+              <w:t xml:space="preserve"> 88%-94% </w:t>
+            </w:r>
+            <w:r>
+              <w:rPr>
+                <w:rFonts w:hint="eastAsia"/>
+              </w:rPr>
+              <w:t>的患者完全無痛</w:t>
+            </w:r>
+            <w:r>
+              <w:t>,</w:t>
+            </w:r>
+            <w:r>
+              <w:rPr>
+                <w:rFonts w:hint="eastAsia"/>
+              </w:rPr>
+              <w:t>。</w:t>
+            </w:r>
+          </w:p>
+        </w:tc>
+        <w:tc>
+          <w:tcPr>
+            <w:tcW w:w="2464" w:type="dxa"/>
+            <w:tcBorders>
+              <w:top w:val="nil"/>
+              <w:left w:val="nil"/>
+              <w:bottom w:val="nil"/>
+              <w:right w:val="nil"/>
+            </w:tcBorders>
+            <w:tcMar>
+              <w:top w:w="80" w:type="dxa"/>
+              <w:left w:w="80" w:type="dxa"/>
+              <w:bottom w:w="80" w:type="dxa"/>
+              <w:right w:w="80" w:type="dxa"/>
+            </w:tcMar>
+            <w:hideMark/>
+          </w:tcPr>
+          <w:p>
+            <w:r>
+              <w:rPr>
+                <w:rFonts w:hint="eastAsia"/>
+              </w:rPr>
+              <w:t>作用極快，高達</w:t>
+            </w:r>
+            <w:r>
+              <w:t xml:space="preserve"> 67% </w:t>
+            </w:r>
+            <w:r>
+              <w:rPr>
+                <w:rFonts w:hint="eastAsia"/>
+              </w:rPr>
+              <w:t>患者在</w:t>
+            </w:r>
+            <w:r>
+              <w:t xml:space="preserve"> 1 </w:t>
+            </w:r>
+            <w:r>
+              <w:rPr>
+                <w:rFonts w:hint="eastAsia"/>
+              </w:rPr>
+              <w:t>週內夜間疼痛即大幅減少。</w:t>
+            </w:r>
+          </w:p>
+        </w:tc>
+      </w:tr>
+      <w:tr>
+        <w:tc>
+          <w:tcPr>
+            <w:tcW w:w="2173" w:type="dxa"/>
+            <w:tcBorders>
+              <w:top w:val="nil"/>
+              <w:left w:val="nil"/>
+              <w:bottom w:val="nil"/>
+              <w:right w:val="nil"/>
+            </w:tcBorders>
+            <w:tcMar>
+              <w:top w:w="80" w:type="dxa"/>
+              <w:left w:w="80" w:type="dxa"/>
+              <w:bottom w:w="80" w:type="dxa"/>
+              <w:right w:w="80" w:type="dxa"/>
+            </w:tcMar>
+            <w:hideMark/>
+          </w:tcPr>
+          <w:p>
+            <w:r>
+              <w:rPr>
+                <w:rFonts w:hint="eastAsia"/>
+                <w:b/>
+                <w:bCs/>
+              </w:rPr>
+              <w:t>肱骨外上髁炎</w:t>
+            </w:r>
+            <w:r>
+              <w:t> (</w:t>
+            </w:r>
+            <w:r>
+              <w:rPr>
+                <w:rFonts w:hint="eastAsia"/>
+              </w:rPr>
+              <w:t>網球肘</w:t>
+            </w:r>
+            <w:r>
+              <w:t xml:space="preserve"> / Lateral Epicondylitis)</w:t>
+            </w:r>
+          </w:p>
+        </w:tc>
+        <w:tc>
+          <w:tcPr>
+            <w:tcW w:w="2173" w:type="dxa"/>
+            <w:tcBorders>
+              <w:top w:val="nil"/>
+              <w:left w:val="nil"/>
+              <w:bottom w:val="nil"/>
+              <w:right w:val="nil"/>
+            </w:tcBorders>
+            <w:tcMar>
+              <w:top w:w="80" w:type="dxa"/>
+              <w:left w:w="80" w:type="dxa"/>
+              <w:bottom w:w="80" w:type="dxa"/>
+              <w:right w:w="80" w:type="dxa"/>
+            </w:tcMar>
+            <w:hideMark/>
+          </w:tcPr>
+          <w:p>
+            <w:r>
+              <w:rPr>
+                <w:rFonts w:hint="eastAsia"/>
+              </w:rPr>
+              <w:t>伸腕肌群過度使用、血管纖維母細胞增生</w:t>
+            </w:r>
+          </w:p>
+        </w:tc>
+        <w:tc>
+          <w:tcPr>
+            <w:tcW w:w="1719" w:type="dxa"/>
+            <w:tcBorders>
+              <w:top w:val="nil"/>
+              <w:left w:val="nil"/>
+              <w:bottom w:val="nil"/>
+              <w:right w:val="nil"/>
+            </w:tcBorders>
+            <w:tcMar>
+              <w:top w:w="80" w:type="dxa"/>
+              <w:left w:w="80" w:type="dxa"/>
+              <w:bottom w:w="80" w:type="dxa"/>
+              <w:right w:w="80" w:type="dxa"/>
+            </w:tcMar>
+            <w:hideMark/>
+          </w:tcPr>
+          <w:p>
+            <w:pPr>
+              <w:rPr>
+                <w:rFonts w:hint="eastAsia"/>
+              </w:rPr>
+            </w:pPr>
+            <w:r>
+              <w:rPr>
+                <w:rFonts w:hint="eastAsia"/>
+              </w:rPr>
+              <w:t>橈側迴返動脈</w:t>
+            </w:r>
+          </w:p>
+        </w:tc>
+        <w:tc>
+          <w:tcPr>
+            <w:tcW w:w="2759" w:type="dxa"/>
+            <w:tcBorders>
+              <w:top w:val="nil"/>
+              <w:left w:val="nil"/>
+              <w:bottom w:val="nil"/>
+              <w:right w:val="nil"/>
+            </w:tcBorders>
+            <w:tcMar>
+              <w:top w:w="80" w:type="dxa"/>
+              <w:left w:w="80" w:type="dxa"/>
+              <w:bottom w:w="80" w:type="dxa"/>
+              <w:right w:w="80" w:type="dxa"/>
+            </w:tcMar>
+            <w:hideMark/>
+          </w:tcPr>
+          <w:p>
+            <w:pPr>
+              <w:rPr>
+                <w:rFonts w:hint="eastAsia"/>
+              </w:rPr>
+            </w:pPr>
+            <w:r>
+              <w:rPr>
+                <w:rFonts w:hint="eastAsia"/>
+              </w:rPr>
+              <w:t>術後</w:t>
+            </w:r>
+            <w:r>
+              <w:t xml:space="preserve"> 6 </w:t>
+            </w:r>
+            <w:r>
+              <w:rPr>
+                <w:rFonts w:hint="eastAsia"/>
+              </w:rPr>
+              <w:t>個月臨床成功率達</w:t>
+            </w:r>
+            <w:r>
+              <w:t xml:space="preserve"> 88%</w:t>
+            </w:r>
+            <w:r>
+              <w:rPr>
+                <w:rFonts w:hint="eastAsia"/>
+              </w:rPr>
+              <w:t>，顯著改善無痛握力</w:t>
+            </w:r>
+            <w:r>
+              <w:t>,</w:t>
+            </w:r>
+            <w:r>
+              <w:rPr>
+                <w:rFonts w:hint="eastAsia"/>
+              </w:rPr>
+              <w:t>。</w:t>
+            </w:r>
+          </w:p>
+        </w:tc>
+        <w:tc>
+          <w:tcPr>
+            <w:tcW w:w="2388" w:type="dxa"/>
+            <w:tcBorders>
+              <w:top w:val="nil"/>
+              <w:left w:val="nil"/>
+              <w:bottom w:val="nil"/>
+              <w:right w:val="nil"/>
+            </w:tcBorders>
+            <w:tcMar>
+              <w:top w:w="80" w:type="dxa"/>
+              <w:left w:w="80" w:type="dxa"/>
+              <w:bottom w:w="80" w:type="dxa"/>
+              <w:right w:w="80" w:type="dxa"/>
+            </w:tcMar>
+            <w:hideMark/>
+          </w:tcPr>
+          <w:p>
+            <w:r>
+              <w:t xml:space="preserve">1 </w:t>
+            </w:r>
+            <w:r>
+              <w:rPr>
+                <w:rFonts w:hint="eastAsia"/>
+              </w:rPr>
+              <w:t>至</w:t>
+            </w:r>
+            <w:r>
+              <w:t xml:space="preserve"> 6 </w:t>
+            </w:r>
+            <w:r>
+              <w:rPr>
+                <w:rFonts w:hint="eastAsia"/>
+              </w:rPr>
+              <w:t>個月持續改善；</w:t>
+            </w:r>
+            <w:r>
+              <w:t xml:space="preserve">MRI </w:t>
+            </w:r>
+            <w:r>
+              <w:rPr>
+                <w:rFonts w:hint="eastAsia"/>
+              </w:rPr>
+              <w:t>顯示</w:t>
+            </w:r>
+            <w:r>
+              <w:t xml:space="preserve"> 2 </w:t>
+            </w:r>
+            <w:r>
+              <w:rPr>
+                <w:rFonts w:hint="eastAsia"/>
+              </w:rPr>
+              <w:t>年後肌腱結構修復</w:t>
+            </w:r>
+            <w:r>
+              <w:t>,</w:t>
+            </w:r>
+            <w:r>
+              <w:rPr>
+                <w:rFonts w:hint="eastAsia"/>
+              </w:rPr>
+              <w:t>。</w:t>
+            </w:r>
+          </w:p>
+        </w:tc>
+      </w:tr>
+      <w:tr>
+        <w:tc>
+          <w:tcPr>
+            <w:tcW w:w="2173" w:type="dxa"/>
+            <w:tcBorders>
+              <w:top w:val="nil"/>
+              <w:left w:val="nil"/>
+              <w:bottom w:val="nil"/>
+              <w:right w:val="nil"/>
+            </w:tcBorders>
+            <w:tcMar>
+              <w:top w:w="80" w:type="dxa"/>
+              <w:left w:w="80" w:type="dxa"/>
+              <w:bottom w:w="80" w:type="dxa"/>
+              <w:right w:w="80" w:type="dxa"/>
+            </w:tcMar>
+            <w:hideMark/>
+          </w:tcPr>
+          <w:p>
+            <w:r>
+              <w:rPr>
+                <w:rFonts w:hint="eastAsia"/>
+                <w:b/>
+                <w:bCs/>
+              </w:rPr>
+              <w:t>肱骨內上髁炎</w:t>
+            </w:r>
+            <w:r>
+              <w:t> (</w:t>
+            </w:r>
+            <w:r>
+              <w:rPr>
+                <w:rFonts w:hint="eastAsia"/>
+              </w:rPr>
+              <w:t>高爾夫球肘</w:t>
+            </w:r>
+            <w:r>
+              <w:t xml:space="preserve"> </w:t>
+            </w:r>
+            <w:r>
+              <w:lastRenderedPageBreak/>
+              <w:t>/ Medial Epicondylitis)</w:t>
+            </w:r>
+          </w:p>
+        </w:tc>
+        <w:tc>
+          <w:tcPr>
+            <w:tcW w:w="2173" w:type="dxa"/>
+            <w:tcBorders>
+              <w:top w:val="nil"/>
+              <w:left w:val="nil"/>
+              <w:bottom w:val="nil"/>
+              <w:right w:val="nil"/>
+            </w:tcBorders>
+            <w:tcMar>
+              <w:top w:w="80" w:type="dxa"/>
+              <w:left w:w="80" w:type="dxa"/>
+              <w:bottom w:w="80" w:type="dxa"/>
+              <w:right w:w="80" w:type="dxa"/>
+            </w:tcMar>
+            <w:hideMark/>
+          </w:tcPr>
+          <w:p>
+            <w:r>
+              <w:rPr>
+                <w:rFonts w:hint="eastAsia"/>
+              </w:rPr>
+              <w:lastRenderedPageBreak/>
+              <w:t>曲腕肌群過度使用、退</w:t>
+            </w:r>
+            <w:r>
+              <w:rPr>
+                <w:rFonts w:hint="eastAsia"/>
+              </w:rPr>
+              <w:lastRenderedPageBreak/>
+              <w:t>化性肌腱炎</w:t>
+            </w:r>
+          </w:p>
+        </w:tc>
+        <w:tc>
+          <w:tcPr>
+            <w:tcW w:w="1719" w:type="dxa"/>
+            <w:tcBorders>
+              <w:top w:val="nil"/>
+              <w:left w:val="nil"/>
+              <w:bottom w:val="nil"/>
+              <w:right w:val="nil"/>
+            </w:tcBorders>
+            <w:tcMar>
+              <w:top w:w="80" w:type="dxa"/>
+              <w:left w:w="80" w:type="dxa"/>
+              <w:bottom w:w="80" w:type="dxa"/>
+              <w:right w:w="80" w:type="dxa"/>
+            </w:tcMar>
+            <w:hideMark/>
+          </w:tcPr>
+          <w:p>
+            <w:pPr>
+              <w:rPr>
+                <w:rFonts w:hint="eastAsia"/>
+              </w:rPr>
+            </w:pPr>
+            <w:r>
+              <w:rPr>
+                <w:rFonts w:hint="eastAsia"/>
+              </w:rPr>
+              <w:lastRenderedPageBreak/>
+              <w:t>尺側迴返動</w:t>
+            </w:r>
+            <w:r>
+              <w:rPr>
+                <w:rFonts w:hint="eastAsia"/>
+              </w:rPr>
+              <w:lastRenderedPageBreak/>
+              <w:t>脈</w:t>
+            </w:r>
+          </w:p>
+        </w:tc>
+        <w:tc>
+          <w:tcPr>
+            <w:tcW w:w="2759" w:type="dxa"/>
+            <w:tcBorders>
+              <w:top w:val="nil"/>
+              <w:left w:val="nil"/>
+              <w:bottom w:val="nil"/>
+              <w:right w:val="nil"/>
+            </w:tcBorders>
+            <w:tcMar>
+              <w:top w:w="80" w:type="dxa"/>
+              <w:left w:w="80" w:type="dxa"/>
+              <w:bottom w:w="80" w:type="dxa"/>
+              <w:right w:w="80" w:type="dxa"/>
+            </w:tcMar>
+            <w:hideMark/>
+          </w:tcPr>
+          <w:p>
+            <w:pPr>
+              <w:rPr>
+                <w:rFonts w:hint="eastAsia"/>
+              </w:rPr>
+            </w:pPr>
+            <w:r>
+              <w:rPr>
+                <w:rFonts w:hint="eastAsia"/>
+              </w:rPr>
+              <w:lastRenderedPageBreak/>
+              <w:t>臨床成功率達</w:t>
+            </w:r>
+            <w:r>
+              <w:t xml:space="preserve"> </w:t>
+            </w:r>
+            <w:r>
+              <w:lastRenderedPageBreak/>
+              <w:t>85.7%</w:t>
+            </w:r>
+            <w:r>
+              <w:rPr>
+                <w:rFonts w:hint="eastAsia"/>
+              </w:rPr>
+              <w:t>。</w:t>
+            </w:r>
+          </w:p>
+        </w:tc>
+        <w:tc>
+          <w:tcPr>
+            <w:tcW w:w="2526" w:type="dxa"/>
+            <w:tcBorders>
+              <w:top w:val="nil"/>
+              <w:left w:val="nil"/>
+              <w:bottom w:val="nil"/>
+              <w:right w:val="nil"/>
+            </w:tcBorders>
+            <w:tcMar>
+              <w:top w:w="80" w:type="dxa"/>
+              <w:left w:w="80" w:type="dxa"/>
+              <w:bottom w:w="80" w:type="dxa"/>
+              <w:right w:w="80" w:type="dxa"/>
+            </w:tcMar>
+            <w:hideMark/>
+          </w:tcPr>
+          <w:p>
+            <w:r>
+              <w:rPr>
+                <w:rFonts w:hint="eastAsia"/>
+              </w:rPr>
+              <w:lastRenderedPageBreak/>
+              <w:t>療效可穩定維持達</w:t>
+            </w:r>
+            <w:r>
+              <w:t xml:space="preserve"> 12 </w:t>
+            </w:r>
+            <w:r>
+              <w:rPr>
+                <w:rFonts w:hint="eastAsia"/>
+              </w:rPr>
+              <w:lastRenderedPageBreak/>
+              <w:t>個月。</w:t>
+            </w:r>
+          </w:p>
+        </w:tc>
+      </w:tr>
+      <w:tr>
+        <w:tc>
+          <w:tcPr>
+            <w:tcW w:w="2146" w:type="dxa"/>
+            <w:tcBorders>
+              <w:top w:val="nil"/>
+              <w:left w:val="nil"/>
+              <w:bottom w:val="nil"/>
+              <w:right w:val="nil"/>
+            </w:tcBorders>
+            <w:tcMar>
+              <w:top w:w="80" w:type="dxa"/>
+              <w:left w:w="80" w:type="dxa"/>
+              <w:bottom w:w="80" w:type="dxa"/>
+              <w:right w:w="80" w:type="dxa"/>
+            </w:tcMar>
+            <w:hideMark/>
+          </w:tcPr>
+          <w:p>
+            <w:r>
+              <w:rPr>
+                <w:rFonts w:hint="eastAsia"/>
+                <w:b/>
+                <w:bCs/>
+              </w:rPr>
+              <w:lastRenderedPageBreak/>
+              <w:t>髕骨</w:t>
+            </w:r>
+            <w:r>
+              <w:rPr>
+                <w:b/>
+                <w:bCs/>
+              </w:rPr>
+              <w:t xml:space="preserve"> / </w:t>
+            </w:r>
+            <w:r>
+              <w:rPr>
+                <w:rFonts w:hint="eastAsia"/>
+                <w:b/>
+                <w:bCs/>
+              </w:rPr>
+              <w:t>股四頭肌肌腱炎</w:t>
+            </w:r>
+            <w:r>
+              <w:t> (</w:t>
+            </w:r>
+            <w:r>
+              <w:rPr>
+                <w:rFonts w:hint="eastAsia"/>
+              </w:rPr>
+              <w:t>跳躍膝</w:t>
+            </w:r>
+            <w:r>
+              <w:t xml:space="preserve"> / Tendinitis)</w:t>
+            </w:r>
+          </w:p>
+        </w:tc>
+        <w:tc>
+          <w:tcPr>
+            <w:tcW w:w="2173" w:type="dxa"/>
+            <w:tcBorders>
+              <w:top w:val="nil"/>
+              <w:left w:val="nil"/>
+              <w:bottom w:val="nil"/>
+              <w:right w:val="nil"/>
+            </w:tcBorders>
+            <w:tcMar>
+              <w:top w:w="80" w:type="dxa"/>
+              <w:left w:w="80" w:type="dxa"/>
+              <w:bottom w:w="80" w:type="dxa"/>
+              <w:right w:w="80" w:type="dxa"/>
+            </w:tcMar>
+            <w:hideMark/>
+          </w:tcPr>
+          <w:p>
+            <w:r>
+              <w:rPr>
+                <w:rFonts w:hint="eastAsia"/>
+              </w:rPr>
+              <w:t>伸肌機制過度使用造成之退化與微血管異常增生</w:t>
+            </w:r>
+          </w:p>
+        </w:tc>
+        <w:tc>
+          <w:tcPr>
+            <w:tcW w:w="1719" w:type="dxa"/>
+            <w:tcBorders>
+              <w:top w:val="nil"/>
+              <w:left w:val="nil"/>
+              <w:bottom w:val="nil"/>
+              <w:right w:val="nil"/>
+            </w:tcBorders>
+            <w:tcMar>
+              <w:top w:w="80" w:type="dxa"/>
+              <w:left w:w="80" w:type="dxa"/>
+              <w:bottom w:w="80" w:type="dxa"/>
+              <w:right w:w="80" w:type="dxa"/>
+            </w:tcMar>
+            <w:hideMark/>
+          </w:tcPr>
+          <w:p>
+            <w:pPr>
+              <w:rPr>
+                <w:rFonts w:hint="eastAsia"/>
+              </w:rPr>
+            </w:pPr>
+            <w:r>
+              <w:rPr>
+                <w:rFonts w:hint="eastAsia"/>
+              </w:rPr>
+              <w:t>膝上動脈、外下膝動脈等</w:t>
+            </w:r>
+          </w:p>
+        </w:tc>
+        <w:tc>
+          <w:tcPr>
+            <w:tcW w:w="2759" w:type="dxa"/>
+            <w:tcBorders>
+              <w:top w:val="nil"/>
+              <w:left w:val="nil"/>
+              <w:bottom w:val="nil"/>
+              <w:right w:val="nil"/>
+            </w:tcBorders>
+            <w:tcMar>
+              <w:top w:w="80" w:type="dxa"/>
+              <w:left w:w="80" w:type="dxa"/>
+              <w:bottom w:w="80" w:type="dxa"/>
+              <w:right w:w="80" w:type="dxa"/>
+            </w:tcMar>
+            <w:hideMark/>
+          </w:tcPr>
+          <w:p>
+            <w:pPr>
+              <w:rPr>
+                <w:rFonts w:hint="eastAsia"/>
+              </w:rPr>
+            </w:pPr>
+            <w:r>
+              <w:rPr>
+                <w:rFonts w:hint="eastAsia"/>
+              </w:rPr>
+              <w:t>疼痛指數</w:t>
+            </w:r>
+            <w:r>
+              <w:t xml:space="preserve"> (NRS) </w:t>
+            </w:r>
+            <w:r>
+              <w:rPr>
+                <w:rFonts w:hint="eastAsia"/>
+              </w:rPr>
+              <w:t>從</w:t>
+            </w:r>
+            <w:r>
+              <w:t xml:space="preserve"> 8 </w:t>
+            </w:r>
+            <w:r>
+              <w:rPr>
+                <w:rFonts w:hint="eastAsia"/>
+              </w:rPr>
+              <w:t>分顯著降至</w:t>
+            </w:r>
+            <w:r>
+              <w:t xml:space="preserve"> 2 </w:t>
+            </w:r>
+            <w:r>
+              <w:rPr>
+                <w:rFonts w:hint="eastAsia"/>
+              </w:rPr>
+              <w:t>分或</w:t>
+            </w:r>
+            <w:r>
+              <w:t xml:space="preserve"> 4 </w:t>
+            </w:r>
+            <w:r>
+              <w:rPr>
+                <w:rFonts w:hint="eastAsia"/>
+              </w:rPr>
+              <w:t>分，</w:t>
+            </w:r>
+            <w:r>
+              <w:t>MRI</w:t>
+            </w:r>
+            <w:r>
+              <w:rPr>
+                <w:rFonts w:hint="eastAsia"/>
+              </w:rPr>
+              <w:t>顯示發炎消退</w:t>
+            </w:r>
+            <w:r>
+              <w:t>,</w:t>
+            </w:r>
+            <w:r>
+              <w:rPr>
+                <w:rFonts w:hint="eastAsia"/>
+              </w:rPr>
+              <w:t>。</w:t>
+            </w:r>
+          </w:p>
+        </w:tc>
+        <w:tc>
+          <w:tcPr>
+            <w:tcW w:w="2424" w:type="dxa"/>
+            <w:tcBorders>
+              <w:top w:val="nil"/>
+              <w:left w:val="nil"/>
+              <w:bottom w:val="nil"/>
+              <w:right w:val="nil"/>
+            </w:tcBorders>
+            <w:tcMar>
+              <w:top w:w="80" w:type="dxa"/>
+              <w:left w:w="80" w:type="dxa"/>
+              <w:bottom w:w="80" w:type="dxa"/>
+              <w:right w:w="80" w:type="dxa"/>
+            </w:tcMar>
+            <w:hideMark/>
+          </w:tcPr>
+          <w:p>
+            <w:r>
+              <w:rPr>
+                <w:rFonts w:hint="eastAsia"/>
+              </w:rPr>
+              <w:t>術後</w:t>
+            </w:r>
+            <w:r>
+              <w:t xml:space="preserve"> 2 </w:t>
+            </w:r>
+            <w:r>
+              <w:rPr>
+                <w:rFonts w:hint="eastAsia"/>
+              </w:rPr>
+              <w:t>週至</w:t>
+            </w:r>
+            <w:r>
+              <w:t xml:space="preserve"> 2 </w:t>
+            </w:r>
+            <w:r>
+              <w:rPr>
+                <w:rFonts w:hint="eastAsia"/>
+              </w:rPr>
+              <w:t>個月內發揮明顯療效，有效降低高強度運動痛感。</w:t>
+            </w:r>
+          </w:p>
+        </w:tc>
+      </w:tr>
+      <w:tr>
+        <w:tc>
+          <w:tcPr>
+            <w:tcW w:w="2146" w:type="dxa"/>
+            <w:tcBorders>
+              <w:top w:val="nil"/>
+              <w:left w:val="nil"/>
+              <w:bottom w:val="nil"/>
+              <w:right w:val="nil"/>
+            </w:tcBorders>
+            <w:tcMar>
+              <w:top w:w="80" w:type="dxa"/>
+              <w:left w:w="80" w:type="dxa"/>
+              <w:bottom w:w="80" w:type="dxa"/>
+              <w:right w:w="80" w:type="dxa"/>
+            </w:tcMar>
+            <w:hideMark/>
+          </w:tcPr>
+          <w:p>
+            <w:r>
+              <w:rPr>
+                <w:rFonts w:hint="eastAsia"/>
+                <w:b/>
+                <w:bCs/>
+              </w:rPr>
+              <w:t>慢性下背痛</w:t>
+            </w:r>
+            <w:r>
+              <w:t> (Lower Back Pain)</w:t>
+            </w:r>
+          </w:p>
+        </w:tc>
+        <w:tc>
+          <w:tcPr>
+            <w:tcW w:w="2189" w:type="dxa"/>
+            <w:tcBorders>
+              <w:top w:val="nil"/>
+              <w:left w:val="nil"/>
+              <w:bottom w:val="nil"/>
+              <w:right w:val="nil"/>
+            </w:tcBorders>
+            <w:tcMar>
+              <w:top w:w="80" w:type="dxa"/>
+              <w:left w:w="80" w:type="dxa"/>
+              <w:bottom w:w="80" w:type="dxa"/>
+              <w:right w:w="80" w:type="dxa"/>
+            </w:tcMar>
+            <w:hideMark/>
+          </w:tcPr>
+          <w:p>
+            <w:r>
+              <w:rPr>
+                <w:rFonts w:hint="eastAsia"/>
+              </w:rPr>
+              <w:t>小面關節</w:t>
+            </w:r>
+            <w:r>
+              <w:t xml:space="preserve"> (Facet joint) </w:t>
+            </w:r>
+            <w:r>
+              <w:rPr>
+                <w:rFonts w:hint="eastAsia"/>
+              </w:rPr>
+              <w:t>或薦髂關節發炎增生血管</w:t>
+            </w:r>
+          </w:p>
+        </w:tc>
+        <w:tc>
+          <w:tcPr>
+            <w:tcW w:w="1719" w:type="dxa"/>
+            <w:tcBorders>
+              <w:top w:val="nil"/>
+              <w:left w:val="nil"/>
+              <w:bottom w:val="nil"/>
+              <w:right w:val="nil"/>
+            </w:tcBorders>
+            <w:tcMar>
+              <w:top w:w="80" w:type="dxa"/>
+              <w:left w:w="80" w:type="dxa"/>
+              <w:bottom w:w="80" w:type="dxa"/>
+              <w:right w:w="80" w:type="dxa"/>
+            </w:tcMar>
+            <w:hideMark/>
+          </w:tcPr>
+          <w:p>
+            <w:r>
+              <w:rPr>
+                <w:rFonts w:hint="eastAsia"/>
+              </w:rPr>
+              <w:t>腰部動脈、外側薦動脈等</w:t>
+            </w:r>
+          </w:p>
+        </w:tc>
+        <w:tc>
+          <w:tcPr>
+            <w:tcW w:w="2759" w:type="dxa"/>
+            <w:tcBorders>
+              <w:top w:val="nil"/>
+              <w:left w:val="nil"/>
+              <w:bottom w:val="nil"/>
+              <w:right w:val="nil"/>
+            </w:tcBorders>
+            <w:tcMar>
+              <w:top w:w="80" w:type="dxa"/>
+              <w:left w:w="80" w:type="dxa"/>
+              <w:bottom w:w="80" w:type="dxa"/>
+              <w:right w:w="80" w:type="dxa"/>
+            </w:tcMar>
+            <w:hideMark/>
+          </w:tcPr>
+          <w:p>
+            <w:pPr>
+              <w:rPr>
+                <w:rFonts w:hint="eastAsia"/>
+              </w:rPr>
+            </w:pPr>
+            <w:r>
+              <w:t xml:space="preserve">3 </w:t>
+            </w:r>
+            <w:r>
+              <w:rPr>
+                <w:rFonts w:hint="eastAsia"/>
+              </w:rPr>
+              <w:t>個月臨床成功率</w:t>
+            </w:r>
+            <w:r>
+              <w:t xml:space="preserve"> 79%</w:t>
+            </w:r>
+            <w:r>
+              <w:rPr>
+                <w:rFonts w:hint="eastAsia"/>
+              </w:rPr>
+              <w:t>；</w:t>
+            </w:r>
+            <w:r>
+              <w:t xml:space="preserve">24 </w:t>
+            </w:r>
+            <w:r>
+              <w:rPr>
+                <w:rFonts w:hint="eastAsia"/>
+              </w:rPr>
+              <w:t>個月為</w:t>
+            </w:r>
+            <w:r>
+              <w:t xml:space="preserve"> 57%</w:t>
+            </w:r>
+            <w:r>
+              <w:rPr>
+                <w:rFonts w:hint="eastAsia"/>
+              </w:rPr>
+              <w:t>。</w:t>
+            </w:r>
+          </w:p>
+        </w:tc>
+        <w:tc>
+          <w:tcPr>
+            <w:tcW w:w="2526" w:type="dxa"/>
+            <w:tcBorders>
+              <w:top w:val="nil"/>
+              <w:left w:val="nil"/>
+              <w:bottom w:val="nil"/>
+              <w:right w:val="nil"/>
+            </w:tcBorders>
+            <w:tcMar>
+              <w:top w:w="80" w:type="dxa"/>
+              <w:left w:w="80" w:type="dxa"/>
+              <w:bottom w:w="80" w:type="dxa"/>
+              <w:right w:w="80" w:type="dxa"/>
+            </w:tcMar>
+            <w:hideMark/>
+          </w:tcPr>
+          <w:p>
+            <w:r>
+              <w:rPr>
+                <w:rFonts w:hint="eastAsia"/>
+              </w:rPr>
+              <w:t>術後</w:t>
+            </w:r>
+            <w:r>
+              <w:t xml:space="preserve"> 1</w:t>
+            </w:r>
+            <w:r>
+              <w:rPr>
+                <w:rFonts w:hint="eastAsia"/>
+              </w:rPr>
+              <w:t>、</w:t>
+            </w:r>
+            <w:r>
+              <w:t>3</w:t>
+            </w:r>
+            <w:r>
+              <w:rPr>
+                <w:rFonts w:hint="eastAsia"/>
+              </w:rPr>
+              <w:t>、</w:t>
+            </w:r>
+            <w:r>
+              <w:t xml:space="preserve">24 </w:t>
+            </w:r>
+            <w:r>
+              <w:rPr>
+                <w:rFonts w:hint="eastAsia"/>
+              </w:rPr>
+              <w:t>個月疼痛指數</w:t>
+            </w:r>
+            <w:r>
+              <w:t>(BPI)</w:t>
+            </w:r>
+            <w:r>
+              <w:rPr>
+                <w:rFonts w:hint="eastAsia"/>
+              </w:rPr>
+              <w:t>均顯著下降</w:t>
+            </w:r>
+            <w:r>
+              <w:t>,</w:t>
+            </w:r>
+            <w:r>
+              <w:rPr>
+                <w:rFonts w:hint="eastAsia"/>
+              </w:rPr>
+              <w:t>。</w:t>
+            </w:r>
+          </w:p>
+        </w:tc>
+      </w:tr>
+      <w:tr>
+        <w:tc>
+          <w:tcPr>
+            <w:tcW w:w="2173" w:type="dxa"/>
+            <w:tcBorders>
+              <w:top w:val="nil"/>
+              <w:left w:val="nil"/>
+              <w:bottom w:val="nil"/>
+              <w:right w:val="nil"/>
+            </w:tcBorders>
+            <w:tcMar>
+              <w:top w:w="80" w:type="dxa"/>
+              <w:left w:w="80" w:type="dxa"/>
+              <w:bottom w:w="80" w:type="dxa"/>
+              <w:right w:w="80" w:type="dxa"/>
+            </w:tcMar>
+            <w:hideMark/>
+          </w:tcPr>
+          <w:p>
+            <w:pPr>
+              <w:rPr>
+                <w:b/>
+                <w:bCs/>
+              </w:rPr>
+            </w:pPr>
+            <w:r>
+              <w:rPr>
+                <w:rFonts w:hint="eastAsia"/>
+                <w:b/>
+                <w:bCs/>
+              </w:rPr>
+              <w:t>斜方肌肌痛</w:t>
+            </w:r>
+          </w:p>
+          <w:p>
+            <w:r>
+              <w:t> (</w:t>
+            </w:r>
+            <w:r>
+              <w:rPr>
+                <w:rFonts w:hint="eastAsia"/>
+              </w:rPr>
+              <w:t>肩頸痠痛</w:t>
+            </w:r>
+            <w:r>
+              <w:t xml:space="preserve"> / Trapezius Myalgia)</w:t>
+            </w:r>
+          </w:p>
+        </w:tc>
+        <w:tc>
+          <w:tcPr>
+            <w:tcW w:w="2173" w:type="dxa"/>
+            <w:tcBorders>
+              <w:top w:val="nil"/>
+              <w:left w:val="nil"/>
+              <w:bottom w:val="nil"/>
+              <w:right w:val="nil"/>
+            </w:tcBorders>
+            <w:tcMar>
+              <w:top w:w="80" w:type="dxa"/>
+              <w:left w:w="80" w:type="dxa"/>
+              <w:bottom w:w="80" w:type="dxa"/>
+              <w:right w:w="80" w:type="dxa"/>
+            </w:tcMar>
+            <w:hideMark/>
+          </w:tcPr>
+          <w:p>
+            <w:r>
+              <w:rPr>
+                <w:rFonts w:hint="eastAsia"/>
+              </w:rPr>
+              <w:t>上斜方肌僵硬、緊繃伴隨發炎物質與血管擴張</w:t>
+            </w:r>
+            <w:r>
+              <w:t>,</w:t>
+            </w:r>
+          </w:p>
+        </w:tc>
+        <w:tc>
+          <w:tcPr>
+            <w:tcW w:w="1719" w:type="dxa"/>
+            <w:tcBorders>
+              <w:top w:val="nil"/>
+              <w:left w:val="nil"/>
+              <w:bottom w:val="nil"/>
+              <w:right w:val="nil"/>
+            </w:tcBorders>
+            <w:tcMar>
+              <w:top w:w="80" w:type="dxa"/>
+              <w:left w:w="80" w:type="dxa"/>
+              <w:bottom w:w="80" w:type="dxa"/>
+              <w:right w:w="80" w:type="dxa"/>
+            </w:tcMar>
+            <w:hideMark/>
+          </w:tcPr>
+          <w:p>
+            <w:r>
+              <w:rPr>
+                <w:rFonts w:hint="eastAsia"/>
+              </w:rPr>
+              <w:t>橫頸動脈、肩胛上動脈等</w:t>
+            </w:r>
+          </w:p>
+        </w:tc>
+        <w:tc>
+          <w:tcPr>
+            <w:tcW w:w="2759" w:type="dxa"/>
+            <w:tcBorders>
+              <w:top w:val="nil"/>
+              <w:left w:val="nil"/>
+              <w:bottom w:val="nil"/>
+              <w:right w:val="nil"/>
+            </w:tcBorders>
+            <w:tcMar>
+              <w:top w:w="80" w:type="dxa"/>
+              <w:left w:w="80" w:type="dxa"/>
+              <w:bottom w:w="80" w:type="dxa"/>
+              <w:right w:w="80" w:type="dxa"/>
+            </w:tcMar>
+            <w:hideMark/>
+          </w:tcPr>
+          <w:p>
+            <w:pPr>
+              <w:rPr>
+                <w:rFonts w:hint="eastAsia"/>
+              </w:rPr>
+            </w:pPr>
+            <w:r>
+              <w:rPr>
+                <w:rFonts w:hint="eastAsia"/>
+              </w:rPr>
+              <w:t>術後</w:t>
+            </w:r>
+            <w:r>
+              <w:t xml:space="preserve"> 6 </w:t>
+            </w:r>
+            <w:r>
+              <w:rPr>
+                <w:rFonts w:hint="eastAsia"/>
+              </w:rPr>
+              <w:t>個月臨床成功率達</w:t>
+            </w:r>
+            <w:r>
+              <w:t xml:space="preserve"> 71.4%</w:t>
+            </w:r>
+            <w:r>
+              <w:rPr>
+                <w:rFonts w:hint="eastAsia"/>
+              </w:rPr>
+              <w:t>。</w:t>
+            </w:r>
+          </w:p>
+        </w:tc>
+        <w:tc>
+          <w:tcPr>
+            <w:tcW w:w="2424" w:type="dxa"/>
+            <w:tcBorders>
+              <w:top w:val="nil"/>
+              <w:left w:val="nil"/>
+              <w:bottom w:val="nil"/>
+              <w:right w:val="nil"/>
+            </w:tcBorders>
+            <w:tcMar>
+              <w:top w:w="80" w:type="dxa"/>
+              <w:left w:w="80" w:type="dxa"/>
+              <w:bottom w:w="80" w:type="dxa"/>
+              <w:right w:w="80" w:type="dxa"/>
+            </w:tcMar>
+            <w:hideMark/>
+          </w:tcPr>
+          <w:p>
+            <w:r>
+              <w:rPr>
+                <w:rFonts w:hint="eastAsia"/>
+              </w:rPr>
+              <w:t>術後</w:t>
+            </w:r>
+            <w:r>
+              <w:t xml:space="preserve"> 1 </w:t>
+            </w:r>
+            <w:r>
+              <w:rPr>
+                <w:rFonts w:hint="eastAsia"/>
+              </w:rPr>
+              <w:t>至</w:t>
+            </w:r>
+            <w:r>
+              <w:t xml:space="preserve"> 6 </w:t>
+            </w:r>
+            <w:r>
+              <w:rPr>
+                <w:rFonts w:hint="eastAsia"/>
+              </w:rPr>
+              <w:t>個月內疼痛及生活干擾指數顯著下降。</w:t>
+            </w:r>
+          </w:p>
+        </w:tc>
+      </w:tr>
+      <w:tr>
+        <w:tc>
+          <w:tcPr>
+            <w:tcW w:w="2173" w:type="dxa"/>
+            <w:tcBorders>
+              <w:top w:val="nil"/>
+              <w:left w:val="nil"/>
+              <w:bottom w:val="nil"/>
+              <w:right w:val="nil"/>
+            </w:tcBorders>
+            <w:tcMar>
+              <w:top w:w="80" w:type="dxa"/>
+              <w:left w:w="80" w:type="dxa"/>
+              <w:bottom w:w="80" w:type="dxa"/>
+              <w:right w:w="80" w:type="dxa"/>
+            </w:tcMar>
+            <w:hideMark/>
+          </w:tcPr>
+          <w:p>
+            <w:r>
+              <w:rPr>
+                <w:rFonts w:hint="eastAsia"/>
+                <w:b/>
+                <w:bCs/>
+              </w:rPr>
+              <w:t>慢性骨盆腔疼痛症候群</w:t>
+            </w:r>
+            <w:r>
+              <w:t xml:space="preserve"> (CPPS / </w:t>
+            </w:r>
+            <w:r>
+              <w:rPr>
+                <w:rFonts w:hint="eastAsia"/>
+              </w:rPr>
+              <w:t>慢性前列腺炎</w:t>
+            </w:r>
+            <w:r>
+              <w:t>)</w:t>
+            </w:r>
+          </w:p>
+        </w:tc>
+        <w:tc>
+          <w:tcPr>
+            <w:tcW w:w="2173" w:type="dxa"/>
+            <w:tcBorders>
+              <w:top w:val="nil"/>
+              <w:left w:val="nil"/>
+              <w:bottom w:val="nil"/>
+              <w:right w:val="nil"/>
+            </w:tcBorders>
+            <w:tcMar>
+              <w:top w:w="80" w:type="dxa"/>
+              <w:left w:w="80" w:type="dxa"/>
+              <w:bottom w:w="80" w:type="dxa"/>
+              <w:right w:w="80" w:type="dxa"/>
+            </w:tcMar>
+            <w:hideMark/>
+          </w:tcPr>
+          <w:p>
+            <w:r>
+              <w:rPr>
+                <w:rFonts w:hint="eastAsia"/>
+              </w:rPr>
+              <w:t>免疫異常發炎、骨盆底肌肉痙攣與血管異常增生</w:t>
+            </w:r>
+            <w:r>
+              <w:t>,</w:t>
+            </w:r>
+          </w:p>
+        </w:tc>
+        <w:tc>
+          <w:tcPr>
+            <w:tcW w:w="1719" w:type="dxa"/>
+            <w:tcBorders>
+              <w:top w:val="nil"/>
+              <w:left w:val="nil"/>
+              <w:bottom w:val="nil"/>
+              <w:right w:val="nil"/>
+            </w:tcBorders>
+            <w:tcMar>
+              <w:top w:w="80" w:type="dxa"/>
+              <w:left w:w="80" w:type="dxa"/>
+              <w:bottom w:w="80" w:type="dxa"/>
+              <w:right w:w="80" w:type="dxa"/>
+            </w:tcMar>
+            <w:hideMark/>
+          </w:tcPr>
+          <w:p>
+            <w:r>
+              <w:rPr>
+                <w:rFonts w:hint="eastAsia"/>
+              </w:rPr>
+              <w:t>前列腺動脈、內陰部動脈</w:t>
+            </w:r>
+          </w:p>
+        </w:tc>
+        <w:tc>
+          <w:tcPr>
+            <w:tcW w:w="2759" w:type="dxa"/>
+            <w:tcBorders>
+              <w:top w:val="nil"/>
+              <w:left w:val="nil"/>
+              <w:bottom w:val="nil"/>
+              <w:right w:val="nil"/>
+            </w:tcBorders>
+            <w:tcMar>
+              <w:top w:w="80" w:type="dxa"/>
+              <w:left w:w="80" w:type="dxa"/>
+              <w:bottom w:w="80" w:type="dxa"/>
+              <w:right w:w="80" w:type="dxa"/>
+            </w:tcMar>
+            <w:hideMark/>
+          </w:tcPr>
+          <w:p>
+            <w:pPr>
+              <w:rPr>
+                <w:rFonts w:hint="eastAsia"/>
+              </w:rPr>
+            </w:pPr>
+            <w:r>
+              <w:t xml:space="preserve">6 </w:t>
+            </w:r>
+            <w:r>
+              <w:rPr>
+                <w:rFonts w:hint="eastAsia"/>
+              </w:rPr>
+              <w:t>個月臨床成功率</w:t>
+            </w:r>
+            <w:r>
+              <w:t xml:space="preserve"> 70%</w:t>
+            </w:r>
+            <w:r>
+              <w:rPr>
+                <w:rFonts w:hint="eastAsia"/>
+              </w:rPr>
+              <w:t>；</w:t>
+            </w:r>
+            <w:r>
+              <w:t xml:space="preserve">16 </w:t>
+            </w:r>
+            <w:r>
+              <w:rPr>
+                <w:rFonts w:hint="eastAsia"/>
+              </w:rPr>
+              <w:t>個月維持在</w:t>
+            </w:r>
+            <w:r>
+              <w:t xml:space="preserve"> 64%</w:t>
+            </w:r>
+            <w:r>
+              <w:rPr>
+                <w:rFonts w:hint="eastAsia"/>
+              </w:rPr>
+              <w:t>。</w:t>
+            </w:r>
+          </w:p>
+        </w:tc>
+        <w:tc>
+          <w:tcPr>
+            <w:tcW w:w="2526" w:type="dxa"/>
+            <w:tcBorders>
+              <w:top w:val="nil"/>
+              <w:left w:val="nil"/>
+              <w:bottom w:val="nil"/>
+              <w:right w:val="nil"/>
+            </w:tcBorders>
+            <w:tcMar>
+              <w:top w:w="80" w:type="dxa"/>
+              <w:left w:w="80" w:type="dxa"/>
+              <w:bottom w:w="80" w:type="dxa"/>
+              <w:right w:w="80" w:type="dxa"/>
+            </w:tcMar>
+            <w:hideMark/>
+          </w:tcPr>
+          <w:p>
+            <w:r>
+              <w:rPr>
+                <w:rFonts w:hint="eastAsia"/>
+              </w:rPr>
+              <w:t>追蹤</w:t>
+            </w:r>
+            <w:r>
+              <w:t xml:space="preserve"> 6 </w:t>
+            </w:r>
+            <w:r>
+              <w:rPr>
+                <w:rFonts w:hint="eastAsia"/>
+              </w:rPr>
+              <w:t>個月內，</w:t>
+            </w:r>
+            <w:r>
+              <w:t xml:space="preserve">NIH-CPSI </w:t>
+            </w:r>
+            <w:r>
+              <w:rPr>
+                <w:rFonts w:hint="eastAsia"/>
+              </w:rPr>
+              <w:t>症狀分數穩定漸進下降</w:t>
+            </w:r>
+            <w:r>
+              <w:t>,</w:t>
+            </w:r>
+            <w:r>
+              <w:rPr>
+                <w:rFonts w:hint="eastAsia"/>
+              </w:rPr>
+              <w:t>。</w:t>
+            </w:r>
+          </w:p>
+        </w:tc>
+      </w:tr>
+      <w:tr>
+        <w:tc>
+          <w:tcPr>
+            <w:tcW w:w="2146" w:type="dxa"/>
+            <w:tcBorders>
+              <w:top w:val="nil"/>
+              <w:left w:val="nil"/>
+              <w:bottom w:val="nil"/>
+              <w:right w:val="nil"/>
+            </w:tcBorders>
+            <w:tcMar>
+              <w:top w:w="80" w:type="dxa"/>
+              <w:left w:w="80" w:type="dxa"/>
+              <w:bottom w:w="80" w:type="dxa"/>
+              <w:right w:w="80" w:type="dxa"/>
+            </w:tcMar>
+            <w:hideMark/>
+          </w:tcPr>
+          <w:p>
+            <w:r>
+              <w:rPr>
+                <w:rFonts w:hint="eastAsia"/>
+                <w:b/>
+                <w:bCs/>
+              </w:rPr>
+              <w:t>幻肢痛</w:t>
+            </w:r>
+            <w:r>
+              <w:t> </w:t>
+            </w:r>
+          </w:p>
+          <w:p>
+            <w:r>
+              <w:t>(Phantom Limb Pain)</w:t>
+            </w:r>
+          </w:p>
+        </w:tc>
+        <w:tc>
+          <w:tcPr>
+            <w:tcW w:w="2173" w:type="dxa"/>
+            <w:tcBorders>
+              <w:top w:val="nil"/>
+              <w:left w:val="nil"/>
+              <w:bottom w:val="nil"/>
+              <w:right w:val="nil"/>
+            </w:tcBorders>
+            <w:tcMar>
+              <w:top w:w="80" w:type="dxa"/>
+              <w:left w:w="80" w:type="dxa"/>
+              <w:bottom w:w="80" w:type="dxa"/>
+              <w:right w:w="80" w:type="dxa"/>
+            </w:tcMar>
+            <w:hideMark/>
+          </w:tcPr>
+          <w:p>
+            <w:r>
+              <w:rPr>
+                <w:rFonts w:hint="eastAsia"/>
+              </w:rPr>
+              <w:t>截肢端神經瘤、周邊神經異常興奮受血管影響</w:t>
+            </w:r>
+            <w:r>
+              <w:t>,</w:t>
+            </w:r>
+          </w:p>
+        </w:tc>
+        <w:tc>
+          <w:tcPr>
+            <w:tcW w:w="1719" w:type="dxa"/>
+            <w:tcBorders>
+              <w:top w:val="nil"/>
+              <w:left w:val="nil"/>
+              <w:bottom w:val="nil"/>
+              <w:right w:val="nil"/>
+            </w:tcBorders>
+            <w:tcMar>
+              <w:top w:w="80" w:type="dxa"/>
+              <w:left w:w="80" w:type="dxa"/>
+              <w:bottom w:w="80" w:type="dxa"/>
+              <w:right w:w="80" w:type="dxa"/>
+            </w:tcMar>
+            <w:hideMark/>
+          </w:tcPr>
+          <w:p>
+            <w:r>
+              <w:rPr>
+                <w:rFonts w:hint="eastAsia"/>
+              </w:rPr>
+              <w:t>股深動脈分支</w:t>
+            </w:r>
+            <w:r>
+              <w:t xml:space="preserve"> (</w:t>
+            </w:r>
+            <w:r>
+              <w:rPr>
+                <w:rFonts w:hint="eastAsia"/>
+              </w:rPr>
+              <w:t>殘肢周邊</w:t>
+            </w:r>
+            <w:r>
+              <w:t>)</w:t>
+            </w:r>
+          </w:p>
+        </w:tc>
+        <w:tc>
+          <w:tcPr>
+            <w:tcW w:w="2775" w:type="dxa"/>
+            <w:tcBorders>
+              <w:top w:val="nil"/>
+              <w:left w:val="nil"/>
+              <w:bottom w:val="nil"/>
+              <w:right w:val="nil"/>
+            </w:tcBorders>
+            <w:tcMar>
+              <w:top w:w="80" w:type="dxa"/>
+              <w:left w:w="80" w:type="dxa"/>
+              <w:bottom w:w="80" w:type="dxa"/>
+              <w:right w:w="80" w:type="dxa"/>
+            </w:tcMar>
+            <w:hideMark/>
+          </w:tcPr>
+          <w:p>
+            <w:r>
+              <w:rPr>
+                <w:rFonts w:hint="eastAsia"/>
+              </w:rPr>
+              <w:t>疼痛指數從發作時的</w:t>
+            </w:r>
+            <w:r>
+              <w:t xml:space="preserve"> 7-10 </w:t>
+            </w:r>
+            <w:r>
+              <w:rPr>
+                <w:rFonts w:hint="eastAsia"/>
+              </w:rPr>
+              <w:t>分劇降至</w:t>
+            </w:r>
+            <w:r>
+              <w:t xml:space="preserve"> 1-2 </w:t>
+            </w:r>
+            <w:r>
+              <w:rPr>
+                <w:rFonts w:hint="eastAsia"/>
+              </w:rPr>
+              <w:t>分，停止干擾睡眠</w:t>
+            </w:r>
+            <w:r>
+              <w:t>,</w:t>
+            </w:r>
+            <w:r>
+              <w:rPr>
+                <w:rFonts w:hint="eastAsia"/>
+              </w:rPr>
+              <w:t>。</w:t>
+            </w:r>
+          </w:p>
+        </w:tc>
+        <w:tc>
+          <w:tcPr>
+            <w:tcW w:w="2526" w:type="dxa"/>
+            <w:tcBorders>
+              <w:top w:val="nil"/>
+              <w:left w:val="nil"/>
+              <w:bottom w:val="nil"/>
+              <w:right w:val="nil"/>
+            </w:tcBorders>
+            <w:tcMar>
+              <w:top w:w="80" w:type="dxa"/>
+              <w:left w:w="80" w:type="dxa"/>
+              <w:bottom w:w="80" w:type="dxa"/>
+              <w:right w:w="80" w:type="dxa"/>
+            </w:tcMar>
+            <w:hideMark/>
+          </w:tcPr>
+          <w:p>
+            <w:r>
+              <w:rPr>
+                <w:rFonts w:hint="eastAsia"/>
+              </w:rPr>
+              <w:t>術後立即見效，且持續</w:t>
+            </w:r>
+            <w:r>
+              <w:t xml:space="preserve"> 6 </w:t>
+            </w:r>
+            <w:r>
+              <w:rPr>
+                <w:rFonts w:hint="eastAsia"/>
+              </w:rPr>
+              <w:t>個月未再引發劇痛。</w:t>
+            </w:r>
+          </w:p>
+        </w:tc>
+      </w:tr>
+    </w:tbl>
+    <w:p/>
+    <w:sectPr>
+      <w:pgSz w:w="11906" w:h="16838"/>
+      <w:pgMar w:top="1440" w:right="1800" w:bottom="1440" w:left="1800" w:header="851" w:footer="992" w:gutter="0"/>
+      <w:cols w:space="425"/>
+      <w:docGrid w:type="lines" w:linePitch="360"/>
     </w:sectPr>
   </w:body>
 </w:document>

</xml_diff>